<commit_message>
creating initial markdown files
Saving the initial content into the markdown files
</commit_message>
<xml_diff>
--- a/ProjectDescription.docx
+++ b/ProjectDescription.docx
@@ -60,8 +60,6 @@
       <w:r>
         <w:rPr>
           <w:rFonts w:ascii="Times New Roman" w:eastAsia="Times New Roman" w:hAnsi="Times New Roman" w:cs="Times New Roman"/>
-          <w:b/>
-          <w:bCs/>
           <w:kern w:val="0"/>
           <w:sz w:val="24"/>
           <w:szCs w:val="24"/>
@@ -203,16 +201,9 @@
           <w:lang w:bidi="ar-SA"/>
           <w14:ligatures w14:val="none"/>
         </w:rPr>
-        <w:t>Multimodal integration (clinical + transcriptomic + CNV) improves:</w:t>
-      </w:r>
-    </w:p>
-    <w:p>
-      <w:pPr>
-        <w:numPr>
-          <w:ilvl w:val="0"/>
-          <w:numId w:val="2"/>
-        </w:numPr>
-        <w:spacing w:before="100" w:beforeAutospacing="1" w:after="100" w:afterAutospacing="1" w:line="240" w:lineRule="auto"/>
+        <w:t>Multimodal integration (clinical</w:t>
+      </w:r>
+      <w:r>
         <w:rPr>
           <w:rFonts w:ascii="Times New Roman" w:eastAsia="Times New Roman" w:hAnsi="Times New Roman" w:cs="Times New Roman"/>
           <w:kern w:val="0"/>
@@ -221,7 +212,8 @@
           <w:lang w:bidi="ar-SA"/>
           <w14:ligatures w14:val="none"/>
         </w:rPr>
-      </w:pPr>
+        <w:t>,</w:t>
+      </w:r>
       <w:r>
         <w:rPr>
           <w:rFonts w:ascii="Times New Roman" w:eastAsia="Times New Roman" w:hAnsi="Times New Roman" w:cs="Times New Roman"/>
@@ -231,16 +223,9 @@
           <w:lang w:bidi="ar-SA"/>
           <w14:ligatures w14:val="none"/>
         </w:rPr>
-        <w:t>Discrimination (C-index)</w:t>
-      </w:r>
-    </w:p>
-    <w:p>
-      <w:pPr>
-        <w:numPr>
-          <w:ilvl w:val="0"/>
-          <w:numId w:val="2"/>
-        </w:numPr>
-        <w:spacing w:before="100" w:beforeAutospacing="1" w:after="100" w:afterAutospacing="1" w:line="240" w:lineRule="auto"/>
+        <w:t xml:space="preserve"> transcriptomic </w:t>
+      </w:r>
+      <w:r>
         <w:rPr>
           <w:rFonts w:ascii="Times New Roman" w:eastAsia="Times New Roman" w:hAnsi="Times New Roman" w:cs="Times New Roman"/>
           <w:kern w:val="0"/>
@@ -249,7 +234,8 @@
           <w:lang w:bidi="ar-SA"/>
           <w14:ligatures w14:val="none"/>
         </w:rPr>
-      </w:pPr>
+        <w:t>and</w:t>
+      </w:r>
       <w:r>
         <w:rPr>
           <w:rFonts w:ascii="Times New Roman" w:eastAsia="Times New Roman" w:hAnsi="Times New Roman" w:cs="Times New Roman"/>
@@ -259,7 +245,7 @@
           <w:lang w:bidi="ar-SA"/>
           <w14:ligatures w14:val="none"/>
         </w:rPr>
-        <w:t>Calibration</w:t>
+        <w:t xml:space="preserve"> CNV) improves:</w:t>
       </w:r>
     </w:p>
     <w:p>
@@ -287,11 +273,15 @@
           <w:lang w:bidi="ar-SA"/>
           <w14:ligatures w14:val="none"/>
         </w:rPr>
-        <w:t>Risk stratification stability</w:t>
+        <w:t>Discrimination (C-index)</w:t>
       </w:r>
     </w:p>
     <w:p>
       <w:pPr>
+        <w:numPr>
+          <w:ilvl w:val="0"/>
+          <w:numId w:val="2"/>
+        </w:numPr>
         <w:spacing w:before="100" w:beforeAutospacing="1" w:after="100" w:afterAutospacing="1" w:line="240" w:lineRule="auto"/>
         <w:rPr>
           <w:rFonts w:ascii="Times New Roman" w:eastAsia="Times New Roman" w:hAnsi="Times New Roman" w:cs="Times New Roman"/>
@@ -311,14 +301,14 @@
           <w:lang w:bidi="ar-SA"/>
           <w14:ligatures w14:val="none"/>
         </w:rPr>
-        <w:t>under:</w:t>
+        <w:t>Calibration</w:t>
       </w:r>
     </w:p>
     <w:p>
       <w:pPr>
         <w:numPr>
           <w:ilvl w:val="0"/>
-          <w:numId w:val="3"/>
+          <w:numId w:val="2"/>
         </w:numPr>
         <w:spacing w:before="100" w:beforeAutospacing="1" w:after="100" w:afterAutospacing="1" w:line="240" w:lineRule="auto"/>
         <w:rPr>
@@ -339,15 +329,11 @@
           <w:lang w:bidi="ar-SA"/>
           <w14:ligatures w14:val="none"/>
         </w:rPr>
-        <w:t>Subgroup evaluation (age, ER status, stage)</w:t>
+        <w:t>Risk stratification stability</w:t>
       </w:r>
     </w:p>
     <w:p>
       <w:pPr>
-        <w:numPr>
-          <w:ilvl w:val="0"/>
-          <w:numId w:val="3"/>
-        </w:numPr>
         <w:spacing w:before="100" w:beforeAutospacing="1" w:after="100" w:afterAutospacing="1" w:line="240" w:lineRule="auto"/>
         <w:rPr>
           <w:rFonts w:ascii="Times New Roman" w:eastAsia="Times New Roman" w:hAnsi="Times New Roman" w:cs="Times New Roman"/>
@@ -367,7 +353,7 @@
           <w:lang w:bidi="ar-SA"/>
           <w14:ligatures w14:val="none"/>
         </w:rPr>
-        <w:t>Robustness stress testing</w:t>
+        <w:t>under:</w:t>
       </w:r>
     </w:p>
     <w:p>
@@ -395,29 +381,79 @@
           <w:lang w:bidi="ar-SA"/>
           <w14:ligatures w14:val="none"/>
         </w:rPr>
-        <w:t>Fairness constraints</w:t>
+        <w:t>Subgroup evaluation (age, ER status, stage)</w:t>
       </w:r>
     </w:p>
     <w:p>
       <w:pPr>
-        <w:pStyle w:val="Heading2"/>
-      </w:pPr>
-      <w:r>
-        <w:t>T</w:t>
-      </w:r>
-      <w:r>
-        <w:t>he Prediction Task</w:t>
+        <w:numPr>
+          <w:ilvl w:val="0"/>
+          <w:numId w:val="3"/>
+        </w:numPr>
+        <w:spacing w:before="100" w:beforeAutospacing="1" w:after="100" w:afterAutospacing="1" w:line="240" w:lineRule="auto"/>
+        <w:rPr>
+          <w:rFonts w:ascii="Times New Roman" w:eastAsia="Times New Roman" w:hAnsi="Times New Roman" w:cs="Times New Roman"/>
+          <w:kern w:val="0"/>
+          <w:sz w:val="24"/>
+          <w:szCs w:val="24"/>
+          <w:lang w:bidi="ar-SA"/>
+          <w14:ligatures w14:val="none"/>
+        </w:rPr>
+      </w:pPr>
+      <w:r>
+        <w:rPr>
+          <w:rFonts w:ascii="Times New Roman" w:eastAsia="Times New Roman" w:hAnsi="Times New Roman" w:cs="Times New Roman"/>
+          <w:kern w:val="0"/>
+          <w:sz w:val="24"/>
+          <w:szCs w:val="24"/>
+          <w:lang w:bidi="ar-SA"/>
+          <w14:ligatures w14:val="none"/>
+        </w:rPr>
+        <w:t>Robustness stress testing</w:t>
       </w:r>
     </w:p>
     <w:p>
-      <w:r>
-        <w:t xml:space="preserve">Our primary task is </w:t>
-      </w:r>
-      <w:r>
-        <w:t>5-year Overall Survival Risk Prediction</w:t>
-      </w:r>
-      <w:r>
-        <w:t>.</w:t>
+      <w:pPr>
+        <w:numPr>
+          <w:ilvl w:val="0"/>
+          <w:numId w:val="3"/>
+        </w:numPr>
+        <w:spacing w:before="100" w:beforeAutospacing="1" w:after="100" w:afterAutospacing="1" w:line="240" w:lineRule="auto"/>
+        <w:rPr>
+          <w:rFonts w:ascii="Times New Roman" w:eastAsia="Times New Roman" w:hAnsi="Times New Roman" w:cs="Times New Roman"/>
+          <w:kern w:val="0"/>
+          <w:sz w:val="24"/>
+          <w:szCs w:val="24"/>
+          <w:lang w:bidi="ar-SA"/>
+          <w14:ligatures w14:val="none"/>
+        </w:rPr>
+      </w:pPr>
+      <w:r>
+        <w:rPr>
+          <w:rFonts w:ascii="Times New Roman" w:eastAsia="Times New Roman" w:hAnsi="Times New Roman" w:cs="Times New Roman"/>
+          <w:kern w:val="0"/>
+          <w:sz w:val="24"/>
+          <w:szCs w:val="24"/>
+          <w:lang w:bidi="ar-SA"/>
+          <w14:ligatures w14:val="none"/>
+        </w:rPr>
+        <w:t>Fairness constraints</w:t>
+      </w:r>
+    </w:p>
+    <w:p>
+      <w:pPr>
+        <w:pStyle w:val="Heading2"/>
+      </w:pPr>
+      <w:r>
+        <w:t>T</w:t>
+      </w:r>
+      <w:r>
+        <w:t>he Prediction Task</w:t>
+      </w:r>
+    </w:p>
+    <w:p>
+      <w:r>
+        <w:t>Our primary task is 5-year Overall Survival Risk Prediction.</w:t>
       </w:r>
       <w:r>
         <w:t xml:space="preserve"> </w:t>
@@ -517,42 +553,55 @@
         <w:pStyle w:val="NormalWeb"/>
       </w:pPr>
       <w:r>
-        <w:t>In this project, I i</w:t>
-      </w:r>
-      <w:r>
-        <w:t xml:space="preserve">mplement both fixed-horizon </w:t>
-      </w:r>
-      <w:r>
-        <w:t>and</w:t>
-      </w:r>
-      <w:r>
-        <w:t xml:space="preserve"> full survival analysis</w:t>
-      </w:r>
-      <w:r>
-        <w:t>.</w:t>
+        <w:t>In this project, I implement both fixed-horizon and full survival analysis.</w:t>
       </w:r>
     </w:p>
     <w:p>
       <w:pPr>
-        <w:pStyle w:val="Heading2"/>
-      </w:pPr>
-      <w:r>
-        <w:lastRenderedPageBreak/>
-        <w:t>Modalities</w:t>
+        <w:pStyle w:val="Heading3"/>
+        <w:rPr>
+          <w:lang w:bidi="ar-SA"/>
+        </w:rPr>
+      </w:pPr>
+      <w:r>
+        <w:t xml:space="preserve">Primary task: </w:t>
+      </w:r>
+      <w:r>
+        <w:rPr>
+          <w:rStyle w:val="Strong"/>
+          <w:b/>
+          <w:bCs w:val="0"/>
+        </w:rPr>
+        <w:t>5-year Overall Survival (OS) risk prediction</w:t>
       </w:r>
     </w:p>
     <w:p>
       <w:pPr>
-        <w:pStyle w:val="Heading3"/>
-        <w:rPr>
-          <w:lang w:bidi="ar-SA"/>
-        </w:rPr>
-      </w:pPr>
-      <w:r>
-        <w:t>Modality</w:t>
-      </w:r>
-      <w:r>
-        <w:t xml:space="preserve"> A — Clinical</w:t>
+        <w:pStyle w:val="NormalWeb"/>
+      </w:pPr>
+      <w:r>
+        <w:rPr>
+          <w:rStyle w:val="Strong"/>
+          <w:rFonts w:eastAsiaTheme="majorEastAsia"/>
+          <w:b w:val="0"/>
+          <w:bCs w:val="0"/>
+        </w:rPr>
+        <w:t>my target is</w:t>
+      </w:r>
+      <w:r>
+        <w:t xml:space="preserve"> probability of death within 5 years of diagnosis/surgery baseline.</w:t>
+      </w:r>
+      <w:r>
+        <w:t xml:space="preserve"> Therefore, the tile horizon is</w:t>
+      </w:r>
+      <w:r>
+        <w:t xml:space="preserve"> 5 years </w:t>
+      </w:r>
+      <w:r>
+        <w:t>or 60 months</w:t>
+      </w:r>
+      <w:r>
+        <w:t>.</w:t>
       </w:r>
     </w:p>
     <w:p>
@@ -560,7 +609,17 @@
         <w:pStyle w:val="NormalWeb"/>
       </w:pPr>
       <w:r>
-        <w:t>Examples:</w:t>
+        <w:lastRenderedPageBreak/>
+        <w:t xml:space="preserve">Therefore, </w:t>
+      </w:r>
+      <w:r>
+        <w:t xml:space="preserve">I </w:t>
+      </w:r>
+      <w:r>
+        <w:t>implement</w:t>
+      </w:r>
+      <w:r>
+        <w:t xml:space="preserve"> both of the following models:</w:t>
       </w:r>
     </w:p>
     <w:p>
@@ -568,11 +627,11 @@
         <w:pStyle w:val="NormalWeb"/>
         <w:numPr>
           <w:ilvl w:val="0"/>
-          <w:numId w:val="4"/>
+          <w:numId w:val="8"/>
         </w:numPr>
       </w:pPr>
       <w:r>
-        <w:t>Age at diagnosis</w:t>
+        <w:t>Binary classification models for predicting fixed-horizon binary risk at 60 months</w:t>
       </w:r>
     </w:p>
     <w:p>
@@ -580,11 +639,37 @@
         <w:pStyle w:val="NormalWeb"/>
         <w:numPr>
           <w:ilvl w:val="0"/>
-          <w:numId w:val="4"/>
+          <w:numId w:val="8"/>
         </w:numPr>
       </w:pPr>
       <w:r>
-        <w:t>Tumor size</w:t>
+        <w:t>Censoring-aware models for predicting survival time as a regression task</w:t>
+      </w:r>
+    </w:p>
+    <w:p>
+      <w:pPr>
+        <w:pStyle w:val="Heading2"/>
+        <w:rPr>
+          <w:rFonts w:ascii="Times New Roman" w:hAnsi="Times New Roman"/>
+          <w:lang w:bidi="ar-SA"/>
+        </w:rPr>
+      </w:pPr>
+      <w:r>
+        <w:t xml:space="preserve">Outcome and censoring rules </w:t>
+      </w:r>
+    </w:p>
+    <w:p>
+      <w:pPr>
+        <w:pStyle w:val="NormalWeb"/>
+      </w:pPr>
+      <w:r>
+        <w:t>I set</w:t>
+      </w:r>
+      <w:r>
+        <w:t xml:space="preserve"> two variables for determining the target of my models including T and E</w:t>
+      </w:r>
+      <w:r>
+        <w:t>:</w:t>
       </w:r>
     </w:p>
     <w:p>
@@ -592,11 +677,20 @@
         <w:pStyle w:val="NormalWeb"/>
         <w:numPr>
           <w:ilvl w:val="0"/>
-          <w:numId w:val="4"/>
+          <w:numId w:val="21"/>
         </w:numPr>
       </w:pPr>
       <w:r>
-        <w:t>Stage</w:t>
+        <w:t>T shows the o</w:t>
+      </w:r>
+      <w:r>
+        <w:t xml:space="preserve">bserved follow-up time </w:t>
+      </w:r>
+      <w:r>
+        <w:t xml:space="preserve">in </w:t>
+      </w:r>
+      <w:r>
+        <w:t>months</w:t>
       </w:r>
     </w:p>
     <w:p>
@@ -604,11 +698,48 @@
         <w:pStyle w:val="NormalWeb"/>
         <w:numPr>
           <w:ilvl w:val="0"/>
-          <w:numId w:val="4"/>
+          <w:numId w:val="21"/>
         </w:numPr>
       </w:pPr>
       <w:r>
-        <w:t>Grade</w:t>
+        <w:rPr>
+          <w:rStyle w:val="HTMLCode"/>
+          <w:rFonts w:asciiTheme="majorBidi" w:eastAsiaTheme="majorEastAsia" w:hAnsiTheme="majorBidi" w:cstheme="majorBidi"/>
+          <w:sz w:val="24"/>
+          <w:szCs w:val="24"/>
+        </w:rPr>
+        <w:t>E is the e</w:t>
+      </w:r>
+      <w:r>
+        <w:t>vent indicator (1=death, 0=censored/alive)</w:t>
+      </w:r>
+    </w:p>
+    <w:p>
+      <w:pPr>
+        <w:pStyle w:val="Heading3"/>
+      </w:pPr>
+      <w:r>
+        <w:t xml:space="preserve">Survival </w:t>
+      </w:r>
+      <w:r>
+        <w:t xml:space="preserve">time </w:t>
+      </w:r>
+      <w:r>
+        <w:t xml:space="preserve">modeling </w:t>
+      </w:r>
+      <w:r>
+        <w:t>output</w:t>
+      </w:r>
+    </w:p>
+    <w:p>
+      <w:pPr>
+        <w:pStyle w:val="NormalWeb"/>
+      </w:pPr>
+      <w:r>
+        <w:t>I use</w:t>
+      </w:r>
+      <w:r>
+        <w:t xml:space="preserve"> the dataset’s OS time and OS status fields mapped into:</w:t>
       </w:r>
     </w:p>
     <w:p>
@@ -616,11 +747,28 @@
         <w:pStyle w:val="NormalWeb"/>
         <w:numPr>
           <w:ilvl w:val="0"/>
-          <w:numId w:val="4"/>
+          <w:numId w:val="22"/>
         </w:numPr>
       </w:pPr>
-      <w:r>
-        <w:t>ER / PR / HER2 status</w:t>
+      <w:proofErr w:type="spellStart"/>
+      <w:r>
+        <w:rPr>
+          <w:rStyle w:val="HTMLCode"/>
+          <w:rFonts w:ascii="Times New Roman" w:eastAsiaTheme="majorEastAsia" w:hAnsi="Times New Roman" w:cs="Times New Roman"/>
+          <w:sz w:val="24"/>
+          <w:szCs w:val="24"/>
+        </w:rPr>
+        <w:t>time_months</w:t>
+      </w:r>
+      <w:proofErr w:type="spellEnd"/>
+      <w:r>
+        <w:rPr>
+          <w:rStyle w:val="HTMLCode"/>
+          <w:rFonts w:ascii="Times New Roman" w:eastAsiaTheme="majorEastAsia" w:hAnsi="Times New Roman" w:cs="Times New Roman"/>
+          <w:sz w:val="24"/>
+          <w:szCs w:val="24"/>
+        </w:rPr>
+        <w:t xml:space="preserve"> = T</w:t>
       </w:r>
     </w:p>
     <w:p>
@@ -628,11 +776,59 @@
         <w:pStyle w:val="NormalWeb"/>
         <w:numPr>
           <w:ilvl w:val="0"/>
-          <w:numId w:val="4"/>
+          <w:numId w:val="22"/>
         </w:numPr>
       </w:pPr>
       <w:r>
-        <w:t>Lymph node status</w:t>
+        <w:rPr>
+          <w:rStyle w:val="HTMLCode"/>
+          <w:rFonts w:ascii="Times New Roman" w:eastAsiaTheme="majorEastAsia" w:hAnsi="Times New Roman" w:cs="Times New Roman"/>
+          <w:sz w:val="24"/>
+          <w:szCs w:val="24"/>
+        </w:rPr>
+        <w:t>event = E</w:t>
+      </w:r>
+    </w:p>
+    <w:p>
+      <w:pPr>
+        <w:pStyle w:val="NormalWeb"/>
+      </w:pPr>
+      <w:r>
+        <w:t>No exclusions needed beyond missing outcome fields.</w:t>
+      </w:r>
+    </w:p>
+    <w:p>
+      <w:pPr>
+        <w:pStyle w:val="Heading3"/>
+      </w:pPr>
+      <w:r>
+        <w:t xml:space="preserve">Fixed-horizon 5-year label </w:t>
+      </w:r>
+      <w:r>
+        <w:t>as binary class label</w:t>
+      </w:r>
+    </w:p>
+    <w:p>
+      <w:pPr>
+        <w:pStyle w:val="NormalWeb"/>
+      </w:pPr>
+      <w:r>
+        <w:t>I defined</w:t>
+      </w:r>
+      <w:r>
+        <w:t xml:space="preserve"> the 5-year endpoint label </w:t>
+      </w:r>
+      <w:r>
+        <w:rPr>
+          <w:rStyle w:val="Strong"/>
+          <w:rFonts w:eastAsiaTheme="majorEastAsia"/>
+          <w:b w:val="0"/>
+          <w:bCs w:val="0"/>
+        </w:rPr>
+        <w:t>y60</w:t>
+      </w:r>
+      <w:r>
+        <w:t>:</w:t>
       </w:r>
     </w:p>
     <w:p>
@@ -640,52 +836,75 @@
         <w:pStyle w:val="NormalWeb"/>
         <w:numPr>
           <w:ilvl w:val="0"/>
-          <w:numId w:val="4"/>
+          <w:numId w:val="23"/>
         </w:numPr>
       </w:pPr>
       <w:r>
-        <w:t>Treatment variables</w:t>
-      </w:r>
-    </w:p>
-    <w:p>
-      <w:pPr>
-        <w:pStyle w:val="Heading3"/>
-      </w:pPr>
-      <w:r>
-        <w:t>Modality B — Gene Expression</w:t>
-      </w:r>
-    </w:p>
-    <w:p>
-      <w:pPr>
-        <w:pStyle w:val="NormalWeb"/>
-      </w:pPr>
-      <w:r>
-        <w:t>~25k genes (microarray)</w:t>
-      </w:r>
-    </w:p>
-    <w:p>
-      <w:pPr>
-        <w:pStyle w:val="Heading3"/>
-      </w:pPr>
-      <w:r>
-        <w:t>Modality C — Copy Number Alteration (CNA)</w:t>
-      </w:r>
-    </w:p>
-    <w:p/>
-    <w:p>
-      <w:pPr>
-        <w:pStyle w:val="Heading2"/>
-      </w:pPr>
-      <w:r>
-        <w:t>Cohort Inclusion Criteria</w:t>
-      </w:r>
-    </w:p>
-    <w:p>
-      <w:pPr>
-        <w:pStyle w:val="NormalWeb"/>
-      </w:pPr>
-      <w:r>
-        <w:t>Inclusion:</w:t>
+        <w:rPr>
+          <w:rStyle w:val="Strong"/>
+          <w:rFonts w:eastAsiaTheme="majorEastAsia"/>
+          <w:b w:val="0"/>
+          <w:bCs w:val="0"/>
+        </w:rPr>
+        <w:t xml:space="preserve">Positive </w:t>
+      </w:r>
+      <w:r>
+        <w:rPr>
+          <w:rStyle w:val="Strong"/>
+          <w:rFonts w:eastAsiaTheme="majorEastAsia"/>
+          <w:b w:val="0"/>
+          <w:bCs w:val="0"/>
+        </w:rPr>
+        <w:t xml:space="preserve">class label </w:t>
+      </w:r>
+      <w:r>
+        <w:rPr>
+          <w:rStyle w:val="Strong"/>
+          <w:rFonts w:eastAsiaTheme="majorEastAsia"/>
+          <w:b w:val="0"/>
+          <w:bCs w:val="0"/>
+        </w:rPr>
+        <w:t>(y60=1)</w:t>
+      </w:r>
+      <w:r>
+        <w:rPr>
+          <w:rStyle w:val="Strong"/>
+          <w:rFonts w:eastAsiaTheme="majorEastAsia"/>
+          <w:b w:val="0"/>
+          <w:bCs w:val="0"/>
+        </w:rPr>
+        <w:t xml:space="preserve"> for cases having</w:t>
+      </w:r>
+      <w:r>
+        <w:t xml:space="preserve"> </w:t>
+      </w:r>
+      <w:r>
+        <w:rPr>
+          <w:rStyle w:val="HTMLCode"/>
+          <w:rFonts w:asciiTheme="majorBidi" w:eastAsiaTheme="majorEastAsia" w:hAnsiTheme="majorBidi" w:cstheme="majorBidi"/>
+          <w:sz w:val="24"/>
+          <w:szCs w:val="24"/>
+        </w:rPr>
+        <w:t>E=1</w:t>
+      </w:r>
+      <w:r>
+        <w:rPr>
+          <w:sz w:val="32"/>
+          <w:szCs w:val="32"/>
+        </w:rPr>
+        <w:t xml:space="preserve"> </w:t>
+      </w:r>
+      <w:r>
+        <w:t xml:space="preserve">AND </w:t>
+      </w:r>
+      <w:r>
+        <w:rPr>
+          <w:rStyle w:val="HTMLCode"/>
+          <w:rFonts w:ascii="Times New Roman" w:eastAsiaTheme="majorEastAsia" w:hAnsi="Times New Roman" w:cs="Times New Roman"/>
+          <w:sz w:val="24"/>
+          <w:szCs w:val="24"/>
+        </w:rPr>
+        <w:t>T &lt;= 60</w:t>
       </w:r>
     </w:p>
     <w:p>
@@ -693,11 +912,71 @@
         <w:pStyle w:val="NormalWeb"/>
         <w:numPr>
           <w:ilvl w:val="0"/>
-          <w:numId w:val="6"/>
+          <w:numId w:val="23"/>
         </w:numPr>
       </w:pPr>
       <w:r>
-        <w:t>Primary breast cancer</w:t>
+        <w:rPr>
+          <w:rStyle w:val="Strong"/>
+          <w:rFonts w:eastAsiaTheme="majorEastAsia"/>
+          <w:b w:val="0"/>
+          <w:bCs w:val="0"/>
+        </w:rPr>
+        <w:t xml:space="preserve">Negative </w:t>
+      </w:r>
+      <w:r>
+        <w:rPr>
+          <w:rStyle w:val="Strong"/>
+          <w:rFonts w:eastAsiaTheme="majorEastAsia"/>
+          <w:b w:val="0"/>
+          <w:bCs w:val="0"/>
+        </w:rPr>
+        <w:t xml:space="preserve">class label </w:t>
+      </w:r>
+      <w:r>
+        <w:rPr>
+          <w:rStyle w:val="Strong"/>
+          <w:rFonts w:eastAsiaTheme="majorEastAsia"/>
+          <w:b w:val="0"/>
+          <w:bCs w:val="0"/>
+        </w:rPr>
+        <w:t>(y60=0</w:t>
+      </w:r>
+      <w:r>
+        <w:rPr>
+          <w:rStyle w:val="Strong"/>
+          <w:rFonts w:asciiTheme="majorBidi" w:eastAsiaTheme="majorEastAsia" w:hAnsiTheme="majorBidi" w:cstheme="majorBidi"/>
+          <w:b w:val="0"/>
+          <w:bCs w:val="0"/>
+        </w:rPr>
+        <w:t>)</w:t>
+      </w:r>
+      <w:r>
+        <w:rPr>
+          <w:rStyle w:val="Strong"/>
+          <w:rFonts w:asciiTheme="majorBidi" w:eastAsiaTheme="majorEastAsia" w:hAnsiTheme="majorBidi" w:cstheme="majorBidi"/>
+          <w:b w:val="0"/>
+          <w:bCs w:val="0"/>
+        </w:rPr>
+        <w:t xml:space="preserve"> for cases having</w:t>
+      </w:r>
+      <w:r>
+        <w:rPr>
+          <w:rFonts w:asciiTheme="majorBidi" w:hAnsiTheme="majorBidi" w:cstheme="majorBidi"/>
+        </w:rPr>
+        <w:t xml:space="preserve"> </w:t>
+      </w:r>
+      <w:r>
+        <w:rPr>
+          <w:rStyle w:val="HTMLCode"/>
+          <w:rFonts w:asciiTheme="majorBidi" w:eastAsiaTheme="majorEastAsia" w:hAnsiTheme="majorBidi" w:cstheme="majorBidi"/>
+          <w:sz w:val="24"/>
+          <w:szCs w:val="24"/>
+        </w:rPr>
+        <w:t>T &gt; 60</w:t>
+      </w:r>
+      <w:r>
+        <w:t xml:space="preserve"> (regardless of E; if death after 60, still not a 5-year event)</w:t>
       </w:r>
     </w:p>
     <w:p>
@@ -705,11 +984,121 @@
         <w:pStyle w:val="NormalWeb"/>
         <w:numPr>
           <w:ilvl w:val="0"/>
-          <w:numId w:val="6"/>
+          <w:numId w:val="23"/>
         </w:numPr>
       </w:pPr>
       <w:r>
-        <w:t>Available survival time + event indicator</w:t>
+        <w:rPr>
+          <w:rStyle w:val="Strong"/>
+          <w:rFonts w:eastAsiaTheme="majorEastAsia"/>
+          <w:b w:val="0"/>
+          <w:bCs w:val="0"/>
+        </w:rPr>
+        <w:t xml:space="preserve">Ambiguous </w:t>
+      </w:r>
+      <w:r>
+        <w:rPr>
+          <w:rStyle w:val="Strong"/>
+          <w:rFonts w:eastAsiaTheme="majorEastAsia"/>
+          <w:b w:val="0"/>
+          <w:bCs w:val="0"/>
+        </w:rPr>
+        <w:t>cases are those having</w:t>
+      </w:r>
+      <w:r>
+        <w:t xml:space="preserve"> </w:t>
+      </w:r>
+      <w:r>
+        <w:rPr>
+          <w:rStyle w:val="HTMLCode"/>
+          <w:rFonts w:ascii="Times New Roman" w:eastAsiaTheme="majorEastAsia" w:hAnsi="Times New Roman" w:cs="Times New Roman"/>
+          <w:sz w:val="24"/>
+          <w:szCs w:val="24"/>
+        </w:rPr>
+        <w:t>E=0</w:t>
+      </w:r>
+      <w:r>
+        <w:t xml:space="preserve"> AND </w:t>
+      </w:r>
+      <w:r>
+        <w:rPr>
+          <w:rStyle w:val="HTMLCode"/>
+          <w:rFonts w:ascii="Times New Roman" w:eastAsiaTheme="majorEastAsia" w:hAnsi="Times New Roman" w:cs="Times New Roman"/>
+          <w:sz w:val="24"/>
+          <w:szCs w:val="24"/>
+        </w:rPr>
+        <w:t>T &lt; 60</w:t>
+      </w:r>
+      <w:r>
+        <w:rPr>
+          <w:rStyle w:val="HTMLCode"/>
+          <w:rFonts w:ascii="Times New Roman" w:eastAsiaTheme="majorEastAsia" w:hAnsi="Times New Roman" w:cs="Times New Roman"/>
+          <w:sz w:val="24"/>
+          <w:szCs w:val="24"/>
+        </w:rPr>
+        <w:t>. Since, t</w:t>
+      </w:r>
+      <w:r>
+        <w:t>hese are right-censored before the horizon, so the 5-year status is unknown.</w:t>
+      </w:r>
+      <w:r>
+        <w:t xml:space="preserve"> Therefore, I exclude them from the study for this task</w:t>
+      </w:r>
+      <w:r>
+        <w:t xml:space="preserve"> of training and evaluating the binary classification models</w:t>
+      </w:r>
+      <w:r>
+        <w:t>.</w:t>
+      </w:r>
+      <w:r>
+        <w:t xml:space="preserve"> </w:t>
+      </w:r>
+      <w:proofErr w:type="gramStart"/>
+      <w:r>
+        <w:t>But,</w:t>
+      </w:r>
+      <w:proofErr w:type="gramEnd"/>
+      <w:r>
+        <w:t xml:space="preserve"> I use them later for </w:t>
+      </w:r>
+      <w:r>
+        <w:t>sensitivity analysis using inverse probability of censoring weights (IPCW).</w:t>
+      </w:r>
+    </w:p>
+    <w:p>
+      <w:pPr>
+        <w:pStyle w:val="Heading2"/>
+      </w:pPr>
+      <w:r>
+        <w:t xml:space="preserve">Modalities </w:t>
+      </w:r>
+      <w:r>
+        <w:t>I</w:t>
+      </w:r>
+      <w:r>
+        <w:t xml:space="preserve"> will treat as “multimodal”</w:t>
+      </w:r>
+    </w:p>
+    <w:p>
+      <w:pPr>
+        <w:pStyle w:val="NormalWeb"/>
+      </w:pPr>
+      <w:r>
+        <w:t xml:space="preserve">For METABRIC from </w:t>
+      </w:r>
+      <w:proofErr w:type="spellStart"/>
+      <w:r>
+        <w:t>cBioPortal</w:t>
+      </w:r>
+      <w:proofErr w:type="spellEnd"/>
+      <w:r>
+        <w:t xml:space="preserve">, </w:t>
+      </w:r>
+      <w:r>
+        <w:t>my</w:t>
+      </w:r>
+      <w:r>
+        <w:t xml:space="preserve"> benchmark modalities are:</w:t>
       </w:r>
     </w:p>
     <w:p>
@@ -717,11 +1106,23 @@
         <w:pStyle w:val="NormalWeb"/>
         <w:numPr>
           <w:ilvl w:val="0"/>
-          <w:numId w:val="6"/>
+          <w:numId w:val="25"/>
         </w:numPr>
       </w:pPr>
       <w:r>
-        <w:t>Available gene expression</w:t>
+        <w:rPr>
+          <w:rStyle w:val="Strong"/>
+          <w:rFonts w:eastAsiaTheme="majorEastAsia"/>
+          <w:b w:val="0"/>
+          <w:bCs w:val="0"/>
+        </w:rPr>
+        <w:t>Clinical</w:t>
+      </w:r>
+      <w:r>
+        <w:t xml:space="preserve"> </w:t>
+      </w:r>
+      <w:r>
+        <w:t>features in tabular format</w:t>
       </w:r>
     </w:p>
     <w:p>
@@ -729,19 +1130,23 @@
         <w:pStyle w:val="NormalWeb"/>
         <w:numPr>
           <w:ilvl w:val="0"/>
-          <w:numId w:val="6"/>
+          <w:numId w:val="25"/>
         </w:numPr>
       </w:pPr>
       <w:r>
-        <w:t>Available clinical data</w:t>
-      </w:r>
-    </w:p>
-    <w:p>
-      <w:pPr>
-        <w:pStyle w:val="NormalWeb"/>
-      </w:pPr>
-      <w:r>
-        <w:t>Exclusion:</w:t>
+        <w:rPr>
+          <w:rStyle w:val="Strong"/>
+          <w:rFonts w:eastAsiaTheme="majorEastAsia"/>
+          <w:b w:val="0"/>
+          <w:bCs w:val="0"/>
+        </w:rPr>
+        <w:t>Gene expression</w:t>
+      </w:r>
+      <w:r>
+        <w:t xml:space="preserve"> data including </w:t>
+      </w:r>
+      <w:r>
+        <w:t>mRNA microarray</w:t>
       </w:r>
     </w:p>
     <w:p>
@@ -749,11 +1154,40 @@
         <w:pStyle w:val="NormalWeb"/>
         <w:numPr>
           <w:ilvl w:val="0"/>
-          <w:numId w:val="7"/>
+          <w:numId w:val="25"/>
         </w:numPr>
       </w:pPr>
       <w:r>
-        <w:t>Missing outcome</w:t>
+        <w:rPr>
+          <w:rStyle w:val="Strong"/>
+          <w:rFonts w:eastAsiaTheme="majorEastAsia"/>
+          <w:b w:val="0"/>
+          <w:bCs w:val="0"/>
+        </w:rPr>
+        <w:t xml:space="preserve">And </w:t>
+      </w:r>
+      <w:r>
+        <w:rPr>
+          <w:rStyle w:val="Strong"/>
+          <w:rFonts w:eastAsiaTheme="majorEastAsia"/>
+          <w:b w:val="0"/>
+          <w:bCs w:val="0"/>
+        </w:rPr>
+        <w:t>Copy number</w:t>
+      </w:r>
+      <w:r>
+        <w:t xml:space="preserve"> (CNA)</w:t>
+      </w:r>
+    </w:p>
+    <w:p>
+      <w:pPr>
+        <w:pStyle w:val="NormalWeb"/>
+      </w:pPr>
+      <w:r>
+        <w:t>I</w:t>
+      </w:r>
+      <w:r>
+        <w:t xml:space="preserve"> will evaluate:</w:t>
       </w:r>
     </w:p>
     <w:p>
@@ -761,67 +1195,11 @@
         <w:pStyle w:val="NormalWeb"/>
         <w:numPr>
           <w:ilvl w:val="0"/>
-          <w:numId w:val="7"/>
+          <w:numId w:val="26"/>
         </w:numPr>
       </w:pPr>
       <w:r>
-        <w:t xml:space="preserve">Follow-up </w:t>
-      </w:r>
-      <w:r>
-        <w:rPr>
-          <w:highlight w:val="yellow"/>
-        </w:rPr>
-        <w:t>&lt; X months</w:t>
-      </w:r>
-    </w:p>
-    <w:p>
-      <w:pPr>
-        <w:pStyle w:val="NormalWeb"/>
-      </w:pPr>
-      <w:r>
-        <w:t xml:space="preserve">These are documented in </w:t>
-      </w:r>
-      <w:r>
-        <w:rPr>
-          <w:highlight w:val="yellow"/>
-        </w:rPr>
-        <w:t>PROJECT_CHARTER.md</w:t>
-      </w:r>
-      <w:r>
-        <w:rPr>
-          <w:highlight w:val="yellow"/>
-        </w:rPr>
-        <w:t>.</w:t>
-      </w:r>
-    </w:p>
-    <w:p>
-      <w:pPr>
-        <w:pStyle w:val="Heading2"/>
-      </w:pPr>
-      <w:r>
-        <w:t>Evaluation Framework</w:t>
-      </w:r>
-    </w:p>
-    <w:p>
-      <w:r>
-        <w:t xml:space="preserve">My considered evaluation metrics for different subtasks in this project are listed below. </w:t>
-      </w:r>
-    </w:p>
-    <w:p>
-      <w:pPr>
-        <w:rPr>
-          <w:rFonts w:ascii="Times New Roman" w:hAnsi="Times New Roman"/>
-          <w:lang w:bidi="ar-SA"/>
-        </w:rPr>
-      </w:pPr>
-      <w:r>
-        <w:t>For d</w:t>
-      </w:r>
-      <w:r>
-        <w:t>iscrimination</w:t>
-      </w:r>
-      <w:r>
-        <w:t xml:space="preserve"> task, I consider:</w:t>
+        <w:t>unimodal baselines (clinical-only, expression-only, CNA-only)</w:t>
       </w:r>
     </w:p>
     <w:p>
@@ -829,11 +1207,33 @@
         <w:pStyle w:val="NormalWeb"/>
         <w:numPr>
           <w:ilvl w:val="0"/>
-          <w:numId w:val="9"/>
+          <w:numId w:val="26"/>
         </w:numPr>
       </w:pPr>
       <w:r>
-        <w:t>Concordance index (C-index)</w:t>
+        <w:lastRenderedPageBreak/>
+        <w:t>bimodal fusion</w:t>
+      </w:r>
+      <w:r>
+        <w:t xml:space="preserve"> considering different combinations of </w:t>
+      </w:r>
+      <w:r>
+        <w:t>clinical</w:t>
+      </w:r>
+      <w:r>
+        <w:t xml:space="preserve"> and </w:t>
+      </w:r>
+      <w:r>
+        <w:t>expression, clinical</w:t>
+      </w:r>
+      <w:r>
+        <w:t xml:space="preserve"> and </w:t>
+      </w:r>
+      <w:r>
+        <w:t>CNA, expression</w:t>
+      </w:r>
+      <w:r>
+        <w:t xml:space="preserve"> and CAN data</w:t>
       </w:r>
     </w:p>
     <w:p>
@@ -841,487 +1241,38 @@
         <w:pStyle w:val="NormalWeb"/>
         <w:numPr>
           <w:ilvl w:val="0"/>
-          <w:numId w:val="9"/>
+          <w:numId w:val="26"/>
         </w:numPr>
       </w:pPr>
       <w:r>
-        <w:t>Time-dependent AUC</w:t>
+        <w:t xml:space="preserve">trimodal fusion </w:t>
+      </w:r>
+      <w:r>
+        <w:t xml:space="preserve">by considering </w:t>
+      </w:r>
+      <w:r>
+        <w:t>clinical</w:t>
+      </w:r>
+      <w:r>
+        <w:t xml:space="preserve">, </w:t>
+      </w:r>
+      <w:r>
+        <w:t>expression</w:t>
+      </w:r>
+      <w:r>
+        <w:t xml:space="preserve"> and CAN data</w:t>
       </w:r>
     </w:p>
     <w:p>
       <w:pPr>
         <w:pStyle w:val="NormalWeb"/>
-        <w:numPr>
-          <w:ilvl w:val="0"/>
-          <w:numId w:val="9"/>
-        </w:numPr>
-      </w:pPr>
-      <w:r>
-        <w:t>AUROC (for 5-year endpoint)</w:t>
-      </w:r>
+      </w:pPr>
     </w:p>
     <w:p>
-      <w:r>
-        <w:lastRenderedPageBreak/>
-        <w:t>For c</w:t>
-      </w:r>
-      <w:r>
-        <w:t>alibration</w:t>
-      </w:r>
-      <w:r>
-        <w:t>, the following ways are considered for evaluation:</w:t>
-      </w:r>
+      <w:pPr>
+        <w:pStyle w:val="NormalWeb"/>
+      </w:pPr>
     </w:p>
-    <w:p>
-      <w:pPr>
-        <w:pStyle w:val="NormalWeb"/>
-        <w:numPr>
-          <w:ilvl w:val="0"/>
-          <w:numId w:val="10"/>
-        </w:numPr>
-      </w:pPr>
-      <w:r>
-        <w:t>Calibration curve</w:t>
-      </w:r>
-    </w:p>
-    <w:p>
-      <w:pPr>
-        <w:pStyle w:val="NormalWeb"/>
-        <w:numPr>
-          <w:ilvl w:val="0"/>
-          <w:numId w:val="10"/>
-        </w:numPr>
-      </w:pPr>
-      <w:r>
-        <w:t>Brier score</w:t>
-      </w:r>
-    </w:p>
-    <w:p>
-      <w:pPr>
-        <w:pStyle w:val="NormalWeb"/>
-        <w:numPr>
-          <w:ilvl w:val="0"/>
-          <w:numId w:val="10"/>
-        </w:numPr>
-      </w:pPr>
-      <w:r>
-        <w:t>Calibration slope</w:t>
-      </w:r>
-    </w:p>
-    <w:p>
-      <w:pPr>
-        <w:pStyle w:val="NormalWeb"/>
-        <w:numPr>
-          <w:ilvl w:val="0"/>
-          <w:numId w:val="10"/>
-        </w:numPr>
-      </w:pPr>
-      <w:r>
-        <w:t>ECE (if binary 5-year risk)</w:t>
-      </w:r>
-    </w:p>
-    <w:p>
-      <w:pPr>
-        <w:pStyle w:val="NormalWeb"/>
-      </w:pPr>
-      <w:r>
-        <w:t>For evaluating f</w:t>
-      </w:r>
-      <w:r>
-        <w:t>airness</w:t>
-      </w:r>
-      <w:r>
-        <w:t xml:space="preserve">, the performance is assessed across: </w:t>
-      </w:r>
-    </w:p>
-    <w:p>
-      <w:pPr>
-        <w:pStyle w:val="NormalWeb"/>
-        <w:numPr>
-          <w:ilvl w:val="0"/>
-          <w:numId w:val="11"/>
-        </w:numPr>
-      </w:pPr>
-      <w:r>
-        <w:t>Age groups</w:t>
-      </w:r>
-    </w:p>
-    <w:p>
-      <w:pPr>
-        <w:pStyle w:val="NormalWeb"/>
-        <w:numPr>
-          <w:ilvl w:val="0"/>
-          <w:numId w:val="11"/>
-        </w:numPr>
-      </w:pPr>
-      <w:r>
-        <w:t>ER status</w:t>
-      </w:r>
-    </w:p>
-    <w:p>
-      <w:pPr>
-        <w:pStyle w:val="NormalWeb"/>
-        <w:numPr>
-          <w:ilvl w:val="0"/>
-          <w:numId w:val="11"/>
-        </w:numPr>
-      </w:pPr>
-      <w:r>
-        <w:t>Stage groups</w:t>
-      </w:r>
-    </w:p>
-    <w:p>
-      <w:pPr>
-        <w:pStyle w:val="NormalWeb"/>
-      </w:pPr>
-      <w:r>
-        <w:t>And the considered m</w:t>
-      </w:r>
-      <w:r>
-        <w:t>etrics</w:t>
-      </w:r>
-      <w:r>
-        <w:t xml:space="preserve"> are</w:t>
-      </w:r>
-      <w:r>
-        <w:t>:</w:t>
-      </w:r>
-    </w:p>
-    <w:p>
-      <w:pPr>
-        <w:pStyle w:val="NormalWeb"/>
-        <w:numPr>
-          <w:ilvl w:val="0"/>
-          <w:numId w:val="12"/>
-        </w:numPr>
-      </w:pPr>
-      <w:r>
-        <w:t>ΔC-index between subgroups</w:t>
-      </w:r>
-    </w:p>
-    <w:p>
-      <w:pPr>
-        <w:pStyle w:val="NormalWeb"/>
-        <w:numPr>
-          <w:ilvl w:val="0"/>
-          <w:numId w:val="12"/>
-        </w:numPr>
-      </w:pPr>
-      <w:r>
-        <w:t>Calibration-by-group</w:t>
-      </w:r>
-    </w:p>
-    <w:p>
-      <w:pPr>
-        <w:pStyle w:val="NormalWeb"/>
-        <w:numPr>
-          <w:ilvl w:val="0"/>
-          <w:numId w:val="12"/>
-        </w:numPr>
-      </w:pPr>
-      <w:r>
-        <w:t>Error disparity at fixed risk threshold</w:t>
-      </w:r>
-    </w:p>
-    <w:p>
-      <w:r>
-        <w:t>For evaluating the r</w:t>
-      </w:r>
-      <w:r>
-        <w:t>obustness</w:t>
-      </w:r>
-      <w:r>
-        <w:t xml:space="preserve"> of my models, I do stress tests including </w:t>
-      </w:r>
-    </w:p>
-    <w:p>
-      <w:pPr>
-        <w:pStyle w:val="NormalWeb"/>
-        <w:numPr>
-          <w:ilvl w:val="0"/>
-          <w:numId w:val="13"/>
-        </w:numPr>
-      </w:pPr>
-      <w:r>
-        <w:t>Random gene dropout</w:t>
-      </w:r>
-    </w:p>
-    <w:p>
-      <w:pPr>
-        <w:pStyle w:val="NormalWeb"/>
-        <w:numPr>
-          <w:ilvl w:val="0"/>
-          <w:numId w:val="13"/>
-        </w:numPr>
-      </w:pPr>
-      <w:r>
-        <w:t>Noise injection</w:t>
-      </w:r>
-    </w:p>
-    <w:p>
-      <w:pPr>
-        <w:pStyle w:val="NormalWeb"/>
-        <w:numPr>
-          <w:ilvl w:val="0"/>
-          <w:numId w:val="13"/>
-        </w:numPr>
-      </w:pPr>
-      <w:r>
-        <w:t>Modality missing simulation</w:t>
-      </w:r>
-    </w:p>
-    <w:p>
-      <w:pPr>
-        <w:pStyle w:val="NormalWeb"/>
-        <w:numPr>
-          <w:ilvl w:val="0"/>
-          <w:numId w:val="13"/>
-        </w:numPr>
-      </w:pPr>
-      <w:r>
-        <w:t>Train/test split by collection site if possible</w:t>
-      </w:r>
-    </w:p>
-    <w:p>
-      <w:pPr>
-        <w:pStyle w:val="Heading2"/>
-      </w:pPr>
-      <w:r>
-        <w:t>Modeling plan</w:t>
-      </w:r>
-    </w:p>
-    <w:p>
-      <w:r>
-        <w:t>The following modeling plans are considered in this project:</w:t>
-      </w:r>
-    </w:p>
-    <w:p>
-      <w:pPr>
-        <w:pStyle w:val="ListParagraph"/>
-        <w:numPr>
-          <w:ilvl w:val="0"/>
-          <w:numId w:val="15"/>
-        </w:numPr>
-      </w:pPr>
-      <w:r>
-        <w:t>Baselines</w:t>
-      </w:r>
-      <w:r>
-        <w:t>, including</w:t>
-      </w:r>
-    </w:p>
-    <w:p>
-      <w:pPr>
-        <w:pStyle w:val="ListParagraph"/>
-        <w:numPr>
-          <w:ilvl w:val="1"/>
-          <w:numId w:val="15"/>
-        </w:numPr>
-      </w:pPr>
-      <w:r>
-        <w:t>Cox proportional hazards (clinical only)</w:t>
-      </w:r>
-    </w:p>
-    <w:p>
-      <w:pPr>
-        <w:pStyle w:val="ListParagraph"/>
-        <w:numPr>
-          <w:ilvl w:val="1"/>
-          <w:numId w:val="15"/>
-        </w:numPr>
-      </w:pPr>
-      <w:r>
-        <w:t>Lasso-Cox (gene only)</w:t>
-      </w:r>
-    </w:p>
-    <w:p>
-      <w:pPr>
-        <w:pStyle w:val="ListParagraph"/>
-        <w:numPr>
-          <w:ilvl w:val="1"/>
-          <w:numId w:val="15"/>
-        </w:numPr>
-      </w:pPr>
-      <w:r>
-        <w:t>Clinical + gene concatenation Cox</w:t>
-      </w:r>
-    </w:p>
-    <w:p>
-      <w:pPr>
-        <w:pStyle w:val="ListParagraph"/>
-        <w:numPr>
-          <w:ilvl w:val="1"/>
-          <w:numId w:val="15"/>
-        </w:numPr>
-      </w:pPr>
-      <w:r>
-        <w:t>Random survival forest</w:t>
-      </w:r>
-    </w:p>
-    <w:p>
-      <w:pPr>
-        <w:pStyle w:val="ListParagraph"/>
-        <w:numPr>
-          <w:ilvl w:val="0"/>
-          <w:numId w:val="15"/>
-        </w:numPr>
-      </w:pPr>
-      <w:r>
-        <w:t>Deep Models</w:t>
-      </w:r>
-      <w:r>
-        <w:t xml:space="preserve"> including</w:t>
-      </w:r>
-    </w:p>
-    <w:p>
-      <w:pPr>
-        <w:pStyle w:val="ListParagraph"/>
-        <w:numPr>
-          <w:ilvl w:val="1"/>
-          <w:numId w:val="15"/>
-        </w:numPr>
-      </w:pPr>
-      <w:proofErr w:type="spellStart"/>
-      <w:r>
-        <w:t>DeepSurv</w:t>
-      </w:r>
-      <w:proofErr w:type="spellEnd"/>
-    </w:p>
-    <w:p>
-      <w:pPr>
-        <w:pStyle w:val="ListParagraph"/>
-        <w:numPr>
-          <w:ilvl w:val="1"/>
-          <w:numId w:val="15"/>
-        </w:numPr>
-      </w:pPr>
-      <w:r>
-        <w:t>Multimodal MLP</w:t>
-      </w:r>
-    </w:p>
-    <w:p>
-      <w:pPr>
-        <w:pStyle w:val="ListParagraph"/>
-        <w:numPr>
-          <w:ilvl w:val="1"/>
-          <w:numId w:val="15"/>
-        </w:numPr>
-      </w:pPr>
-      <w:r>
-        <w:t>Gated fusion network</w:t>
-      </w:r>
-    </w:p>
-    <w:p>
-      <w:pPr>
-        <w:pStyle w:val="ListParagraph"/>
-        <w:numPr>
-          <w:ilvl w:val="1"/>
-          <w:numId w:val="15"/>
-        </w:numPr>
-      </w:pPr>
-      <w:r>
-        <w:t>Modality dropout training</w:t>
-      </w:r>
-    </w:p>
-    <w:p>
-      <w:pPr>
-        <w:pStyle w:val="Heading2"/>
-      </w:pPr>
-      <w:r>
-        <w:t>My reproducibility plan</w:t>
-      </w:r>
-    </w:p>
-    <w:p>
-      <w:pPr>
-        <w:pStyle w:val="NormalWeb"/>
-      </w:pPr>
-      <w:r>
-        <w:t>From Day 1</w:t>
-      </w:r>
-      <w:r>
-        <w:t>, I use</w:t>
-      </w:r>
-      <w:r>
-        <w:t>:</w:t>
-      </w:r>
-    </w:p>
-    <w:p>
-      <w:pPr>
-        <w:pStyle w:val="NormalWeb"/>
-        <w:numPr>
-          <w:ilvl w:val="0"/>
-          <w:numId w:val="18"/>
-        </w:numPr>
-      </w:pPr>
-      <w:r>
-        <w:t>Fixed random seeds</w:t>
-      </w:r>
-    </w:p>
-    <w:p>
-      <w:pPr>
-        <w:pStyle w:val="NormalWeb"/>
-        <w:numPr>
-          <w:ilvl w:val="0"/>
-          <w:numId w:val="18"/>
-        </w:numPr>
-      </w:pPr>
-      <w:r>
-        <w:t>Stratified train/val</w:t>
-      </w:r>
-      <w:r>
-        <w:t>idation</w:t>
-      </w:r>
-      <w:r>
-        <w:t>/test splits</w:t>
-      </w:r>
-    </w:p>
-    <w:p>
-      <w:pPr>
-        <w:pStyle w:val="NormalWeb"/>
-        <w:numPr>
-          <w:ilvl w:val="0"/>
-          <w:numId w:val="18"/>
-        </w:numPr>
-      </w:pPr>
-      <w:r>
-        <w:lastRenderedPageBreak/>
-        <w:t>Nested cross-validation</w:t>
-      </w:r>
-    </w:p>
-    <w:p>
-      <w:pPr>
-        <w:pStyle w:val="NormalWeb"/>
-        <w:numPr>
-          <w:ilvl w:val="0"/>
-          <w:numId w:val="18"/>
-        </w:numPr>
-      </w:pPr>
-      <w:r>
-        <w:t>Config-driven experiments (Hydra or YAML configs)</w:t>
-      </w:r>
-    </w:p>
-    <w:p>
-      <w:pPr>
-        <w:pStyle w:val="NormalWeb"/>
-        <w:numPr>
-          <w:ilvl w:val="0"/>
-          <w:numId w:val="18"/>
-        </w:numPr>
-      </w:pPr>
-      <w:r>
-        <w:t>All results saved automatically</w:t>
-      </w:r>
-    </w:p>
-    <w:p>
-      <w:pPr>
-        <w:pStyle w:val="NormalWeb"/>
-      </w:pPr>
-    </w:p>
-    <w:p/>
-    <w:p/>
-    <w:p/>
-    <w:p/>
-    <w:p/>
     <w:sectPr>
       <w:pgSz w:w="12240" w:h="15840"/>
       <w:pgMar w:top="1440" w:right="1440" w:bottom="1440" w:left="1440" w:header="720" w:footer="720" w:gutter="0"/>
@@ -1335,6 +1286,119 @@
 <file path=word/numbering.xml><?xml version="1.0" encoding="utf-8"?>
 <w:numbering xmlns:wpc="http://schemas.microsoft.com/office/word/2010/wordprocessingCanvas" xmlns:cx="http://schemas.microsoft.com/office/drawing/2014/chartex" xmlns:cx1="http://schemas.microsoft.com/office/drawing/2015/9/8/chartex" xmlns:cx2="http://schemas.microsoft.com/office/drawing/2015/10/21/chartex" xmlns:cx3="http://schemas.microsoft.com/office/drawing/2016/5/9/chartex" xmlns:cx4="http://schemas.microsoft.com/office/drawing/2016/5/10/chartex" xmlns:cx5="http://schemas.microsoft.com/office/drawing/2016/5/11/chartex" xmlns:cx6="http://schemas.microsoft.com/office/drawing/2016/5/12/chartex" xmlns:cx7="http://schemas.microsoft.com/office/drawing/2016/5/13/chartex" xmlns:cx8="http://schemas.microsoft.com/office/drawing/2016/5/14/chartex" xmlns:mc="http://schemas.openxmlformats.org/markup-compatibility/2006" xmlns:aink="http://schemas.microsoft.com/office/drawing/2016/ink" xmlns:am3d="http://schemas.microsoft.com/office/drawing/2017/model3d" xmlns:o="urn:schemas-microsoft-com:office:office" xmlns:oel="http://schemas.microsoft.com/office/2019/extlst" xmlns:r="http://schemas.openxmlformats.org/officeDocument/2006/relationships" xmlns:m="http://schemas.openxmlformats.org/officeDocument/2006/math" xmlns:v="urn:schemas-microsoft-com:vml" xmlns:wp14="http://schemas.microsoft.com/office/word/2010/wordprocessingDrawing" xmlns:wp="http://schemas.openxmlformats.org/drawingml/2006/wordprocessingDrawing" xmlns:w10="urn:schemas-microsoft-com:office:word" xmlns:w="http://schemas.openxmlformats.org/wordprocessingml/2006/main" xmlns:w14="http://schemas.microsoft.com/office/word/2010/wordml" xmlns:w15="http://schemas.microsoft.com/office/word/2012/wordml" xmlns:w16cex="http://schemas.microsoft.com/office/word/2018/wordml/cex" xmlns:w16cid="http://schemas.microsoft.com/office/word/2016/wordml/cid" xmlns:w16="http://schemas.microsoft.com/office/word/2018/wordml" xmlns:w16du="http://schemas.microsoft.com/office/word/2023/wordml/word16du" xmlns:w16sdtdh="http://schemas.microsoft.com/office/word/2020/wordml/sdtdatahash" xmlns:w16sdtfl="http://schemas.microsoft.com/office/word/2024/wordml/sdtformatlock" xmlns:w16se="http://schemas.microsoft.com/office/word/2015/wordml/symex" xmlns:wpg="http://schemas.microsoft.com/office/word/2010/wordprocessingGroup" xmlns:wpi="http://schemas.microsoft.com/office/word/2010/wordprocessingInk" xmlns:wne="http://schemas.microsoft.com/office/word/2006/wordml" xmlns:wps="http://schemas.microsoft.com/office/word/2010/wordprocessingShape" mc:Ignorable="w14 w15 w16se w16cid w16 w16cex w16sdtdh w16sdtfl w16du wp14">
   <w:abstractNum w:abstractNumId="0" w15:restartNumberingAfterBreak="0">
+    <w:nsid w:val="0B2406F4"/>
+    <w:multiLevelType w:val="multilevel"/>
+    <w:tmpl w:val="D1F67406"/>
+    <w:lvl w:ilvl="0">
+      <w:start w:val="1"/>
+      <w:numFmt w:val="decimal"/>
+      <w:lvlText w:val="%1."/>
+      <w:lvlJc w:val="left"/>
+      <w:pPr>
+        <w:tabs>
+          <w:tab w:val="num" w:pos="720"/>
+        </w:tabs>
+        <w:ind w:left="720" w:hanging="360"/>
+      </w:pPr>
+    </w:lvl>
+    <w:lvl w:ilvl="1" w:tentative="1">
+      <w:start w:val="1"/>
+      <w:numFmt w:val="decimal"/>
+      <w:lvlText w:val="%2."/>
+      <w:lvlJc w:val="left"/>
+      <w:pPr>
+        <w:tabs>
+          <w:tab w:val="num" w:pos="1440"/>
+        </w:tabs>
+        <w:ind w:left="1440" w:hanging="360"/>
+      </w:pPr>
+    </w:lvl>
+    <w:lvl w:ilvl="2" w:tentative="1">
+      <w:start w:val="1"/>
+      <w:numFmt w:val="decimal"/>
+      <w:lvlText w:val="%3."/>
+      <w:lvlJc w:val="left"/>
+      <w:pPr>
+        <w:tabs>
+          <w:tab w:val="num" w:pos="2160"/>
+        </w:tabs>
+        <w:ind w:left="2160" w:hanging="360"/>
+      </w:pPr>
+    </w:lvl>
+    <w:lvl w:ilvl="3" w:tentative="1">
+      <w:start w:val="1"/>
+      <w:numFmt w:val="decimal"/>
+      <w:lvlText w:val="%4."/>
+      <w:lvlJc w:val="left"/>
+      <w:pPr>
+        <w:tabs>
+          <w:tab w:val="num" w:pos="2880"/>
+        </w:tabs>
+        <w:ind w:left="2880" w:hanging="360"/>
+      </w:pPr>
+    </w:lvl>
+    <w:lvl w:ilvl="4" w:tentative="1">
+      <w:start w:val="1"/>
+      <w:numFmt w:val="decimal"/>
+      <w:lvlText w:val="%5."/>
+      <w:lvlJc w:val="left"/>
+      <w:pPr>
+        <w:tabs>
+          <w:tab w:val="num" w:pos="3600"/>
+        </w:tabs>
+        <w:ind w:left="3600" w:hanging="360"/>
+      </w:pPr>
+    </w:lvl>
+    <w:lvl w:ilvl="5" w:tentative="1">
+      <w:start w:val="1"/>
+      <w:numFmt w:val="decimal"/>
+      <w:lvlText w:val="%6."/>
+      <w:lvlJc w:val="left"/>
+      <w:pPr>
+        <w:tabs>
+          <w:tab w:val="num" w:pos="4320"/>
+        </w:tabs>
+        <w:ind w:left="4320" w:hanging="360"/>
+      </w:pPr>
+    </w:lvl>
+    <w:lvl w:ilvl="6" w:tentative="1">
+      <w:start w:val="1"/>
+      <w:numFmt w:val="decimal"/>
+      <w:lvlText w:val="%7."/>
+      <w:lvlJc w:val="left"/>
+      <w:pPr>
+        <w:tabs>
+          <w:tab w:val="num" w:pos="5040"/>
+        </w:tabs>
+        <w:ind w:left="5040" w:hanging="360"/>
+      </w:pPr>
+    </w:lvl>
+    <w:lvl w:ilvl="7" w:tentative="1">
+      <w:start w:val="1"/>
+      <w:numFmt w:val="decimal"/>
+      <w:lvlText w:val="%8."/>
+      <w:lvlJc w:val="left"/>
+      <w:pPr>
+        <w:tabs>
+          <w:tab w:val="num" w:pos="5760"/>
+        </w:tabs>
+        <w:ind w:left="5760" w:hanging="360"/>
+      </w:pPr>
+    </w:lvl>
+    <w:lvl w:ilvl="8" w:tentative="1">
+      <w:start w:val="1"/>
+      <w:numFmt w:val="decimal"/>
+      <w:lvlText w:val="%9."/>
+      <w:lvlJc w:val="left"/>
+      <w:pPr>
+        <w:tabs>
+          <w:tab w:val="num" w:pos="6480"/>
+        </w:tabs>
+        <w:ind w:left="6480" w:hanging="360"/>
+      </w:pPr>
+    </w:lvl>
+  </w:abstractNum>
+  <w:abstractNum w:abstractNumId="1" w15:restartNumberingAfterBreak="0">
     <w:nsid w:val="20581974"/>
     <w:multiLevelType w:val="multilevel"/>
     <w:tmpl w:val="5F442D76"/>
@@ -1483,7 +1547,7 @@
       </w:rPr>
     </w:lvl>
   </w:abstractNum>
-  <w:abstractNum w:abstractNumId="1" w15:restartNumberingAfterBreak="0">
+  <w:abstractNum w:abstractNumId="2" w15:restartNumberingAfterBreak="0">
     <w:nsid w:val="22C5195C"/>
     <w:multiLevelType w:val="multilevel"/>
     <w:tmpl w:val="17DCAB7C"/>
@@ -1632,7 +1696,7 @@
       </w:rPr>
     </w:lvl>
   </w:abstractNum>
-  <w:abstractNum w:abstractNumId="2" w15:restartNumberingAfterBreak="0">
+  <w:abstractNum w:abstractNumId="3" w15:restartNumberingAfterBreak="0">
     <w:nsid w:val="25736E9E"/>
     <w:multiLevelType w:val="multilevel"/>
     <w:tmpl w:val="EED06AB4"/>
@@ -1781,7 +1845,156 @@
       </w:rPr>
     </w:lvl>
   </w:abstractNum>
-  <w:abstractNum w:abstractNumId="3" w15:restartNumberingAfterBreak="0">
+  <w:abstractNum w:abstractNumId="4" w15:restartNumberingAfterBreak="0">
+    <w:nsid w:val="301713A2"/>
+    <w:multiLevelType w:val="multilevel"/>
+    <w:tmpl w:val="AD401FB8"/>
+    <w:lvl w:ilvl="0">
+      <w:start w:val="1"/>
+      <w:numFmt w:val="bullet"/>
+      <w:lvlText w:val=""/>
+      <w:lvlJc w:val="left"/>
+      <w:pPr>
+        <w:tabs>
+          <w:tab w:val="num" w:pos="720"/>
+        </w:tabs>
+        <w:ind w:left="720" w:hanging="360"/>
+      </w:pPr>
+      <w:rPr>
+        <w:rFonts w:ascii="Symbol" w:hAnsi="Symbol" w:hint="default"/>
+        <w:sz w:val="20"/>
+      </w:rPr>
+    </w:lvl>
+    <w:lvl w:ilvl="1" w:tentative="1">
+      <w:start w:val="1"/>
+      <w:numFmt w:val="bullet"/>
+      <w:lvlText w:val="o"/>
+      <w:lvlJc w:val="left"/>
+      <w:pPr>
+        <w:tabs>
+          <w:tab w:val="num" w:pos="1440"/>
+        </w:tabs>
+        <w:ind w:left="1440" w:hanging="360"/>
+      </w:pPr>
+      <w:rPr>
+        <w:rFonts w:ascii="Courier New" w:hAnsi="Courier New" w:hint="default"/>
+        <w:sz w:val="20"/>
+      </w:rPr>
+    </w:lvl>
+    <w:lvl w:ilvl="2" w:tentative="1">
+      <w:start w:val="1"/>
+      <w:numFmt w:val="bullet"/>
+      <w:lvlText w:val=""/>
+      <w:lvlJc w:val="left"/>
+      <w:pPr>
+        <w:tabs>
+          <w:tab w:val="num" w:pos="2160"/>
+        </w:tabs>
+        <w:ind w:left="2160" w:hanging="360"/>
+      </w:pPr>
+      <w:rPr>
+        <w:rFonts w:ascii="Wingdings" w:hAnsi="Wingdings" w:hint="default"/>
+        <w:sz w:val="20"/>
+      </w:rPr>
+    </w:lvl>
+    <w:lvl w:ilvl="3" w:tentative="1">
+      <w:start w:val="1"/>
+      <w:numFmt w:val="bullet"/>
+      <w:lvlText w:val=""/>
+      <w:lvlJc w:val="left"/>
+      <w:pPr>
+        <w:tabs>
+          <w:tab w:val="num" w:pos="2880"/>
+        </w:tabs>
+        <w:ind w:left="2880" w:hanging="360"/>
+      </w:pPr>
+      <w:rPr>
+        <w:rFonts w:ascii="Wingdings" w:hAnsi="Wingdings" w:hint="default"/>
+        <w:sz w:val="20"/>
+      </w:rPr>
+    </w:lvl>
+    <w:lvl w:ilvl="4" w:tentative="1">
+      <w:start w:val="1"/>
+      <w:numFmt w:val="bullet"/>
+      <w:lvlText w:val=""/>
+      <w:lvlJc w:val="left"/>
+      <w:pPr>
+        <w:tabs>
+          <w:tab w:val="num" w:pos="3600"/>
+        </w:tabs>
+        <w:ind w:left="3600" w:hanging="360"/>
+      </w:pPr>
+      <w:rPr>
+        <w:rFonts w:ascii="Wingdings" w:hAnsi="Wingdings" w:hint="default"/>
+        <w:sz w:val="20"/>
+      </w:rPr>
+    </w:lvl>
+    <w:lvl w:ilvl="5" w:tentative="1">
+      <w:start w:val="1"/>
+      <w:numFmt w:val="bullet"/>
+      <w:lvlText w:val=""/>
+      <w:lvlJc w:val="left"/>
+      <w:pPr>
+        <w:tabs>
+          <w:tab w:val="num" w:pos="4320"/>
+        </w:tabs>
+        <w:ind w:left="4320" w:hanging="360"/>
+      </w:pPr>
+      <w:rPr>
+        <w:rFonts w:ascii="Wingdings" w:hAnsi="Wingdings" w:hint="default"/>
+        <w:sz w:val="20"/>
+      </w:rPr>
+    </w:lvl>
+    <w:lvl w:ilvl="6" w:tentative="1">
+      <w:start w:val="1"/>
+      <w:numFmt w:val="bullet"/>
+      <w:lvlText w:val=""/>
+      <w:lvlJc w:val="left"/>
+      <w:pPr>
+        <w:tabs>
+          <w:tab w:val="num" w:pos="5040"/>
+        </w:tabs>
+        <w:ind w:left="5040" w:hanging="360"/>
+      </w:pPr>
+      <w:rPr>
+        <w:rFonts w:ascii="Wingdings" w:hAnsi="Wingdings" w:hint="default"/>
+        <w:sz w:val="20"/>
+      </w:rPr>
+    </w:lvl>
+    <w:lvl w:ilvl="7" w:tentative="1">
+      <w:start w:val="1"/>
+      <w:numFmt w:val="bullet"/>
+      <w:lvlText w:val=""/>
+      <w:lvlJc w:val="left"/>
+      <w:pPr>
+        <w:tabs>
+          <w:tab w:val="num" w:pos="5760"/>
+        </w:tabs>
+        <w:ind w:left="5760" w:hanging="360"/>
+      </w:pPr>
+      <w:rPr>
+        <w:rFonts w:ascii="Wingdings" w:hAnsi="Wingdings" w:hint="default"/>
+        <w:sz w:val="20"/>
+      </w:rPr>
+    </w:lvl>
+    <w:lvl w:ilvl="8" w:tentative="1">
+      <w:start w:val="1"/>
+      <w:numFmt w:val="bullet"/>
+      <w:lvlText w:val=""/>
+      <w:lvlJc w:val="left"/>
+      <w:pPr>
+        <w:tabs>
+          <w:tab w:val="num" w:pos="6480"/>
+        </w:tabs>
+        <w:ind w:left="6480" w:hanging="360"/>
+      </w:pPr>
+      <w:rPr>
+        <w:rFonts w:ascii="Wingdings" w:hAnsi="Wingdings" w:hint="default"/>
+        <w:sz w:val="20"/>
+      </w:rPr>
+    </w:lvl>
+  </w:abstractNum>
+  <w:abstractNum w:abstractNumId="5" w15:restartNumberingAfterBreak="0">
     <w:nsid w:val="35554E56"/>
     <w:multiLevelType w:val="multilevel"/>
     <w:tmpl w:val="F7EE19C2"/>
@@ -1930,7 +2143,7 @@
       </w:rPr>
     </w:lvl>
   </w:abstractNum>
-  <w:abstractNum w:abstractNumId="4" w15:restartNumberingAfterBreak="0">
+  <w:abstractNum w:abstractNumId="6" w15:restartNumberingAfterBreak="0">
     <w:nsid w:val="37D23ADC"/>
     <w:multiLevelType w:val="hybridMultilevel"/>
     <w:tmpl w:val="8A566AF6"/>
@@ -2043,7 +2256,7 @@
       </w:rPr>
     </w:lvl>
   </w:abstractNum>
-  <w:abstractNum w:abstractNumId="5" w15:restartNumberingAfterBreak="0">
+  <w:abstractNum w:abstractNumId="7" w15:restartNumberingAfterBreak="0">
     <w:nsid w:val="388E6D8F"/>
     <w:multiLevelType w:val="multilevel"/>
     <w:tmpl w:val="B7860DD4"/>
@@ -2192,10 +2405,10 @@
       </w:rPr>
     </w:lvl>
   </w:abstractNum>
-  <w:abstractNum w:abstractNumId="6" w15:restartNumberingAfterBreak="0">
+  <w:abstractNum w:abstractNumId="8" w15:restartNumberingAfterBreak="0">
     <w:nsid w:val="3B200668"/>
     <w:multiLevelType w:val="multilevel"/>
-    <w:tmpl w:val="F8DC9B86"/>
+    <w:tmpl w:val="0F082BDA"/>
     <w:lvl w:ilvl="0">
       <w:start w:val="1"/>
       <w:numFmt w:val="bullet"/>
@@ -2228,6 +2441,150 @@
         <w:sz w:val="20"/>
       </w:rPr>
     </w:lvl>
+    <w:lvl w:ilvl="2">
+      <w:numFmt w:val="bullet"/>
+      <w:lvlText w:val="-"/>
+      <w:lvlJc w:val="left"/>
+      <w:pPr>
+        <w:ind w:left="2160" w:hanging="360"/>
+      </w:pPr>
+      <w:rPr>
+        <w:rFonts w:ascii="Times New Roman" w:eastAsia="Times New Roman" w:hAnsi="Times New Roman" w:cs="Times New Roman" w:hint="default"/>
+      </w:rPr>
+    </w:lvl>
+    <w:lvl w:ilvl="3" w:tentative="1">
+      <w:start w:val="1"/>
+      <w:numFmt w:val="bullet"/>
+      <w:lvlText w:val=""/>
+      <w:lvlJc w:val="left"/>
+      <w:pPr>
+        <w:tabs>
+          <w:tab w:val="num" w:pos="2880"/>
+        </w:tabs>
+        <w:ind w:left="2880" w:hanging="360"/>
+      </w:pPr>
+      <w:rPr>
+        <w:rFonts w:ascii="Wingdings" w:hAnsi="Wingdings" w:hint="default"/>
+        <w:sz w:val="20"/>
+      </w:rPr>
+    </w:lvl>
+    <w:lvl w:ilvl="4" w:tentative="1">
+      <w:start w:val="1"/>
+      <w:numFmt w:val="bullet"/>
+      <w:lvlText w:val=""/>
+      <w:lvlJc w:val="left"/>
+      <w:pPr>
+        <w:tabs>
+          <w:tab w:val="num" w:pos="3600"/>
+        </w:tabs>
+        <w:ind w:left="3600" w:hanging="360"/>
+      </w:pPr>
+      <w:rPr>
+        <w:rFonts w:ascii="Wingdings" w:hAnsi="Wingdings" w:hint="default"/>
+        <w:sz w:val="20"/>
+      </w:rPr>
+    </w:lvl>
+    <w:lvl w:ilvl="5" w:tentative="1">
+      <w:start w:val="1"/>
+      <w:numFmt w:val="bullet"/>
+      <w:lvlText w:val=""/>
+      <w:lvlJc w:val="left"/>
+      <w:pPr>
+        <w:tabs>
+          <w:tab w:val="num" w:pos="4320"/>
+        </w:tabs>
+        <w:ind w:left="4320" w:hanging="360"/>
+      </w:pPr>
+      <w:rPr>
+        <w:rFonts w:ascii="Wingdings" w:hAnsi="Wingdings" w:hint="default"/>
+        <w:sz w:val="20"/>
+      </w:rPr>
+    </w:lvl>
+    <w:lvl w:ilvl="6" w:tentative="1">
+      <w:start w:val="1"/>
+      <w:numFmt w:val="bullet"/>
+      <w:lvlText w:val=""/>
+      <w:lvlJc w:val="left"/>
+      <w:pPr>
+        <w:tabs>
+          <w:tab w:val="num" w:pos="5040"/>
+        </w:tabs>
+        <w:ind w:left="5040" w:hanging="360"/>
+      </w:pPr>
+      <w:rPr>
+        <w:rFonts w:ascii="Wingdings" w:hAnsi="Wingdings" w:hint="default"/>
+        <w:sz w:val="20"/>
+      </w:rPr>
+    </w:lvl>
+    <w:lvl w:ilvl="7" w:tentative="1">
+      <w:start w:val="1"/>
+      <w:numFmt w:val="bullet"/>
+      <w:lvlText w:val=""/>
+      <w:lvlJc w:val="left"/>
+      <w:pPr>
+        <w:tabs>
+          <w:tab w:val="num" w:pos="5760"/>
+        </w:tabs>
+        <w:ind w:left="5760" w:hanging="360"/>
+      </w:pPr>
+      <w:rPr>
+        <w:rFonts w:ascii="Wingdings" w:hAnsi="Wingdings" w:hint="default"/>
+        <w:sz w:val="20"/>
+      </w:rPr>
+    </w:lvl>
+    <w:lvl w:ilvl="8" w:tentative="1">
+      <w:start w:val="1"/>
+      <w:numFmt w:val="bullet"/>
+      <w:lvlText w:val=""/>
+      <w:lvlJc w:val="left"/>
+      <w:pPr>
+        <w:tabs>
+          <w:tab w:val="num" w:pos="6480"/>
+        </w:tabs>
+        <w:ind w:left="6480" w:hanging="360"/>
+      </w:pPr>
+      <w:rPr>
+        <w:rFonts w:ascii="Wingdings" w:hAnsi="Wingdings" w:hint="default"/>
+        <w:sz w:val="20"/>
+      </w:rPr>
+    </w:lvl>
+  </w:abstractNum>
+  <w:abstractNum w:abstractNumId="9" w15:restartNumberingAfterBreak="0">
+    <w:nsid w:val="3C857205"/>
+    <w:multiLevelType w:val="multilevel"/>
+    <w:tmpl w:val="E5E4F0FA"/>
+    <w:lvl w:ilvl="0">
+      <w:start w:val="1"/>
+      <w:numFmt w:val="bullet"/>
+      <w:lvlText w:val=""/>
+      <w:lvlJc w:val="left"/>
+      <w:pPr>
+        <w:tabs>
+          <w:tab w:val="num" w:pos="720"/>
+        </w:tabs>
+        <w:ind w:left="720" w:hanging="360"/>
+      </w:pPr>
+      <w:rPr>
+        <w:rFonts w:ascii="Symbol" w:hAnsi="Symbol" w:hint="default"/>
+        <w:sz w:val="20"/>
+      </w:rPr>
+    </w:lvl>
+    <w:lvl w:ilvl="1" w:tentative="1">
+      <w:start w:val="1"/>
+      <w:numFmt w:val="bullet"/>
+      <w:lvlText w:val="o"/>
+      <w:lvlJc w:val="left"/>
+      <w:pPr>
+        <w:tabs>
+          <w:tab w:val="num" w:pos="1440"/>
+        </w:tabs>
+        <w:ind w:left="1440" w:hanging="360"/>
+      </w:pPr>
+      <w:rPr>
+        <w:rFonts w:ascii="Courier New" w:hAnsi="Courier New" w:hint="default"/>
+        <w:sz w:val="20"/>
+      </w:rPr>
+    </w:lvl>
     <w:lvl w:ilvl="2" w:tentative="1">
       <w:start w:val="1"/>
       <w:numFmt w:val="bullet"/>
@@ -2341,7 +2698,156 @@
       </w:rPr>
     </w:lvl>
   </w:abstractNum>
-  <w:abstractNum w:abstractNumId="7" w15:restartNumberingAfterBreak="0">
+  <w:abstractNum w:abstractNumId="10" w15:restartNumberingAfterBreak="0">
+    <w:nsid w:val="3EAD3829"/>
+    <w:multiLevelType w:val="multilevel"/>
+    <w:tmpl w:val="86BC6600"/>
+    <w:lvl w:ilvl="0">
+      <w:start w:val="1"/>
+      <w:numFmt w:val="bullet"/>
+      <w:lvlText w:val=""/>
+      <w:lvlJc w:val="left"/>
+      <w:pPr>
+        <w:tabs>
+          <w:tab w:val="num" w:pos="720"/>
+        </w:tabs>
+        <w:ind w:left="720" w:hanging="360"/>
+      </w:pPr>
+      <w:rPr>
+        <w:rFonts w:ascii="Symbol" w:hAnsi="Symbol" w:hint="default"/>
+        <w:sz w:val="20"/>
+      </w:rPr>
+    </w:lvl>
+    <w:lvl w:ilvl="1" w:tentative="1">
+      <w:start w:val="1"/>
+      <w:numFmt w:val="bullet"/>
+      <w:lvlText w:val="o"/>
+      <w:lvlJc w:val="left"/>
+      <w:pPr>
+        <w:tabs>
+          <w:tab w:val="num" w:pos="1440"/>
+        </w:tabs>
+        <w:ind w:left="1440" w:hanging="360"/>
+      </w:pPr>
+      <w:rPr>
+        <w:rFonts w:ascii="Courier New" w:hAnsi="Courier New" w:hint="default"/>
+        <w:sz w:val="20"/>
+      </w:rPr>
+    </w:lvl>
+    <w:lvl w:ilvl="2" w:tentative="1">
+      <w:start w:val="1"/>
+      <w:numFmt w:val="bullet"/>
+      <w:lvlText w:val=""/>
+      <w:lvlJc w:val="left"/>
+      <w:pPr>
+        <w:tabs>
+          <w:tab w:val="num" w:pos="2160"/>
+        </w:tabs>
+        <w:ind w:left="2160" w:hanging="360"/>
+      </w:pPr>
+      <w:rPr>
+        <w:rFonts w:ascii="Wingdings" w:hAnsi="Wingdings" w:hint="default"/>
+        <w:sz w:val="20"/>
+      </w:rPr>
+    </w:lvl>
+    <w:lvl w:ilvl="3" w:tentative="1">
+      <w:start w:val="1"/>
+      <w:numFmt w:val="bullet"/>
+      <w:lvlText w:val=""/>
+      <w:lvlJc w:val="left"/>
+      <w:pPr>
+        <w:tabs>
+          <w:tab w:val="num" w:pos="2880"/>
+        </w:tabs>
+        <w:ind w:left="2880" w:hanging="360"/>
+      </w:pPr>
+      <w:rPr>
+        <w:rFonts w:ascii="Wingdings" w:hAnsi="Wingdings" w:hint="default"/>
+        <w:sz w:val="20"/>
+      </w:rPr>
+    </w:lvl>
+    <w:lvl w:ilvl="4" w:tentative="1">
+      <w:start w:val="1"/>
+      <w:numFmt w:val="bullet"/>
+      <w:lvlText w:val=""/>
+      <w:lvlJc w:val="left"/>
+      <w:pPr>
+        <w:tabs>
+          <w:tab w:val="num" w:pos="3600"/>
+        </w:tabs>
+        <w:ind w:left="3600" w:hanging="360"/>
+      </w:pPr>
+      <w:rPr>
+        <w:rFonts w:ascii="Wingdings" w:hAnsi="Wingdings" w:hint="default"/>
+        <w:sz w:val="20"/>
+      </w:rPr>
+    </w:lvl>
+    <w:lvl w:ilvl="5" w:tentative="1">
+      <w:start w:val="1"/>
+      <w:numFmt w:val="bullet"/>
+      <w:lvlText w:val=""/>
+      <w:lvlJc w:val="left"/>
+      <w:pPr>
+        <w:tabs>
+          <w:tab w:val="num" w:pos="4320"/>
+        </w:tabs>
+        <w:ind w:left="4320" w:hanging="360"/>
+      </w:pPr>
+      <w:rPr>
+        <w:rFonts w:ascii="Wingdings" w:hAnsi="Wingdings" w:hint="default"/>
+        <w:sz w:val="20"/>
+      </w:rPr>
+    </w:lvl>
+    <w:lvl w:ilvl="6" w:tentative="1">
+      <w:start w:val="1"/>
+      <w:numFmt w:val="bullet"/>
+      <w:lvlText w:val=""/>
+      <w:lvlJc w:val="left"/>
+      <w:pPr>
+        <w:tabs>
+          <w:tab w:val="num" w:pos="5040"/>
+        </w:tabs>
+        <w:ind w:left="5040" w:hanging="360"/>
+      </w:pPr>
+      <w:rPr>
+        <w:rFonts w:ascii="Wingdings" w:hAnsi="Wingdings" w:hint="default"/>
+        <w:sz w:val="20"/>
+      </w:rPr>
+    </w:lvl>
+    <w:lvl w:ilvl="7" w:tentative="1">
+      <w:start w:val="1"/>
+      <w:numFmt w:val="bullet"/>
+      <w:lvlText w:val=""/>
+      <w:lvlJc w:val="left"/>
+      <w:pPr>
+        <w:tabs>
+          <w:tab w:val="num" w:pos="5760"/>
+        </w:tabs>
+        <w:ind w:left="5760" w:hanging="360"/>
+      </w:pPr>
+      <w:rPr>
+        <w:rFonts w:ascii="Wingdings" w:hAnsi="Wingdings" w:hint="default"/>
+        <w:sz w:val="20"/>
+      </w:rPr>
+    </w:lvl>
+    <w:lvl w:ilvl="8" w:tentative="1">
+      <w:start w:val="1"/>
+      <w:numFmt w:val="bullet"/>
+      <w:lvlText w:val=""/>
+      <w:lvlJc w:val="left"/>
+      <w:pPr>
+        <w:tabs>
+          <w:tab w:val="num" w:pos="6480"/>
+        </w:tabs>
+        <w:ind w:left="6480" w:hanging="360"/>
+      </w:pPr>
+      <w:rPr>
+        <w:rFonts w:ascii="Wingdings" w:hAnsi="Wingdings" w:hint="default"/>
+        <w:sz w:val="20"/>
+      </w:rPr>
+    </w:lvl>
+  </w:abstractNum>
+  <w:abstractNum w:abstractNumId="11" w15:restartNumberingAfterBreak="0">
     <w:nsid w:val="3EB311B6"/>
     <w:multiLevelType w:val="multilevel"/>
     <w:tmpl w:val="643E3BCA"/>
@@ -2490,7 +2996,7 @@
       </w:rPr>
     </w:lvl>
   </w:abstractNum>
-  <w:abstractNum w:abstractNumId="8" w15:restartNumberingAfterBreak="0">
+  <w:abstractNum w:abstractNumId="12" w15:restartNumberingAfterBreak="0">
     <w:nsid w:val="402F799A"/>
     <w:multiLevelType w:val="multilevel"/>
     <w:tmpl w:val="A9F82C76"/>
@@ -2639,7 +3145,7 @@
       </w:rPr>
     </w:lvl>
   </w:abstractNum>
-  <w:abstractNum w:abstractNumId="9" w15:restartNumberingAfterBreak="0">
+  <w:abstractNum w:abstractNumId="13" w15:restartNumberingAfterBreak="0">
     <w:nsid w:val="480E1411"/>
     <w:multiLevelType w:val="multilevel"/>
     <w:tmpl w:val="02142F14"/>
@@ -2788,7 +3294,7 @@
       </w:rPr>
     </w:lvl>
   </w:abstractNum>
-  <w:abstractNum w:abstractNumId="10" w15:restartNumberingAfterBreak="0">
+  <w:abstractNum w:abstractNumId="14" w15:restartNumberingAfterBreak="0">
     <w:nsid w:val="492C6EB7"/>
     <w:multiLevelType w:val="multilevel"/>
     <w:tmpl w:val="583A41B8"/>
@@ -2937,7 +3443,156 @@
       </w:rPr>
     </w:lvl>
   </w:abstractNum>
-  <w:abstractNum w:abstractNumId="11" w15:restartNumberingAfterBreak="0">
+  <w:abstractNum w:abstractNumId="15" w15:restartNumberingAfterBreak="0">
+    <w:nsid w:val="4B38797A"/>
+    <w:multiLevelType w:val="multilevel"/>
+    <w:tmpl w:val="39607CC6"/>
+    <w:lvl w:ilvl="0">
+      <w:start w:val="1"/>
+      <w:numFmt w:val="bullet"/>
+      <w:lvlText w:val=""/>
+      <w:lvlJc w:val="left"/>
+      <w:pPr>
+        <w:tabs>
+          <w:tab w:val="num" w:pos="720"/>
+        </w:tabs>
+        <w:ind w:left="720" w:hanging="360"/>
+      </w:pPr>
+      <w:rPr>
+        <w:rFonts w:ascii="Symbol" w:hAnsi="Symbol" w:hint="default"/>
+        <w:sz w:val="20"/>
+      </w:rPr>
+    </w:lvl>
+    <w:lvl w:ilvl="1" w:tentative="1">
+      <w:start w:val="1"/>
+      <w:numFmt w:val="bullet"/>
+      <w:lvlText w:val="o"/>
+      <w:lvlJc w:val="left"/>
+      <w:pPr>
+        <w:tabs>
+          <w:tab w:val="num" w:pos="1440"/>
+        </w:tabs>
+        <w:ind w:left="1440" w:hanging="360"/>
+      </w:pPr>
+      <w:rPr>
+        <w:rFonts w:ascii="Courier New" w:hAnsi="Courier New" w:hint="default"/>
+        <w:sz w:val="20"/>
+      </w:rPr>
+    </w:lvl>
+    <w:lvl w:ilvl="2" w:tentative="1">
+      <w:start w:val="1"/>
+      <w:numFmt w:val="bullet"/>
+      <w:lvlText w:val=""/>
+      <w:lvlJc w:val="left"/>
+      <w:pPr>
+        <w:tabs>
+          <w:tab w:val="num" w:pos="2160"/>
+        </w:tabs>
+        <w:ind w:left="2160" w:hanging="360"/>
+      </w:pPr>
+      <w:rPr>
+        <w:rFonts w:ascii="Wingdings" w:hAnsi="Wingdings" w:hint="default"/>
+        <w:sz w:val="20"/>
+      </w:rPr>
+    </w:lvl>
+    <w:lvl w:ilvl="3" w:tentative="1">
+      <w:start w:val="1"/>
+      <w:numFmt w:val="bullet"/>
+      <w:lvlText w:val=""/>
+      <w:lvlJc w:val="left"/>
+      <w:pPr>
+        <w:tabs>
+          <w:tab w:val="num" w:pos="2880"/>
+        </w:tabs>
+        <w:ind w:left="2880" w:hanging="360"/>
+      </w:pPr>
+      <w:rPr>
+        <w:rFonts w:ascii="Wingdings" w:hAnsi="Wingdings" w:hint="default"/>
+        <w:sz w:val="20"/>
+      </w:rPr>
+    </w:lvl>
+    <w:lvl w:ilvl="4" w:tentative="1">
+      <w:start w:val="1"/>
+      <w:numFmt w:val="bullet"/>
+      <w:lvlText w:val=""/>
+      <w:lvlJc w:val="left"/>
+      <w:pPr>
+        <w:tabs>
+          <w:tab w:val="num" w:pos="3600"/>
+        </w:tabs>
+        <w:ind w:left="3600" w:hanging="360"/>
+      </w:pPr>
+      <w:rPr>
+        <w:rFonts w:ascii="Wingdings" w:hAnsi="Wingdings" w:hint="default"/>
+        <w:sz w:val="20"/>
+      </w:rPr>
+    </w:lvl>
+    <w:lvl w:ilvl="5" w:tentative="1">
+      <w:start w:val="1"/>
+      <w:numFmt w:val="bullet"/>
+      <w:lvlText w:val=""/>
+      <w:lvlJc w:val="left"/>
+      <w:pPr>
+        <w:tabs>
+          <w:tab w:val="num" w:pos="4320"/>
+        </w:tabs>
+        <w:ind w:left="4320" w:hanging="360"/>
+      </w:pPr>
+      <w:rPr>
+        <w:rFonts w:ascii="Wingdings" w:hAnsi="Wingdings" w:hint="default"/>
+        <w:sz w:val="20"/>
+      </w:rPr>
+    </w:lvl>
+    <w:lvl w:ilvl="6" w:tentative="1">
+      <w:start w:val="1"/>
+      <w:numFmt w:val="bullet"/>
+      <w:lvlText w:val=""/>
+      <w:lvlJc w:val="left"/>
+      <w:pPr>
+        <w:tabs>
+          <w:tab w:val="num" w:pos="5040"/>
+        </w:tabs>
+        <w:ind w:left="5040" w:hanging="360"/>
+      </w:pPr>
+      <w:rPr>
+        <w:rFonts w:ascii="Wingdings" w:hAnsi="Wingdings" w:hint="default"/>
+        <w:sz w:val="20"/>
+      </w:rPr>
+    </w:lvl>
+    <w:lvl w:ilvl="7" w:tentative="1">
+      <w:start w:val="1"/>
+      <w:numFmt w:val="bullet"/>
+      <w:lvlText w:val=""/>
+      <w:lvlJc w:val="left"/>
+      <w:pPr>
+        <w:tabs>
+          <w:tab w:val="num" w:pos="5760"/>
+        </w:tabs>
+        <w:ind w:left="5760" w:hanging="360"/>
+      </w:pPr>
+      <w:rPr>
+        <w:rFonts w:ascii="Wingdings" w:hAnsi="Wingdings" w:hint="default"/>
+        <w:sz w:val="20"/>
+      </w:rPr>
+    </w:lvl>
+    <w:lvl w:ilvl="8" w:tentative="1">
+      <w:start w:val="1"/>
+      <w:numFmt w:val="bullet"/>
+      <w:lvlText w:val=""/>
+      <w:lvlJc w:val="left"/>
+      <w:pPr>
+        <w:tabs>
+          <w:tab w:val="num" w:pos="6480"/>
+        </w:tabs>
+        <w:ind w:left="6480" w:hanging="360"/>
+      </w:pPr>
+      <w:rPr>
+        <w:rFonts w:ascii="Wingdings" w:hAnsi="Wingdings" w:hint="default"/>
+        <w:sz w:val="20"/>
+      </w:rPr>
+    </w:lvl>
+  </w:abstractNum>
+  <w:abstractNum w:abstractNumId="16" w15:restartNumberingAfterBreak="0">
     <w:nsid w:val="509F2900"/>
     <w:multiLevelType w:val="multilevel"/>
     <w:tmpl w:val="48F2D006"/>
@@ -3086,7 +3741,120 @@
       </w:rPr>
     </w:lvl>
   </w:abstractNum>
-  <w:abstractNum w:abstractNumId="12" w15:restartNumberingAfterBreak="0">
+  <w:abstractNum w:abstractNumId="17" w15:restartNumberingAfterBreak="0">
+    <w:nsid w:val="519C0442"/>
+    <w:multiLevelType w:val="multilevel"/>
+    <w:tmpl w:val="091A8978"/>
+    <w:lvl w:ilvl="0">
+      <w:start w:val="1"/>
+      <w:numFmt w:val="decimal"/>
+      <w:lvlText w:val="%1."/>
+      <w:lvlJc w:val="left"/>
+      <w:pPr>
+        <w:tabs>
+          <w:tab w:val="num" w:pos="720"/>
+        </w:tabs>
+        <w:ind w:left="720" w:hanging="360"/>
+      </w:pPr>
+    </w:lvl>
+    <w:lvl w:ilvl="1" w:tentative="1">
+      <w:start w:val="1"/>
+      <w:numFmt w:val="decimal"/>
+      <w:lvlText w:val="%2."/>
+      <w:lvlJc w:val="left"/>
+      <w:pPr>
+        <w:tabs>
+          <w:tab w:val="num" w:pos="1440"/>
+        </w:tabs>
+        <w:ind w:left="1440" w:hanging="360"/>
+      </w:pPr>
+    </w:lvl>
+    <w:lvl w:ilvl="2" w:tentative="1">
+      <w:start w:val="1"/>
+      <w:numFmt w:val="decimal"/>
+      <w:lvlText w:val="%3."/>
+      <w:lvlJc w:val="left"/>
+      <w:pPr>
+        <w:tabs>
+          <w:tab w:val="num" w:pos="2160"/>
+        </w:tabs>
+        <w:ind w:left="2160" w:hanging="360"/>
+      </w:pPr>
+    </w:lvl>
+    <w:lvl w:ilvl="3" w:tentative="1">
+      <w:start w:val="1"/>
+      <w:numFmt w:val="decimal"/>
+      <w:lvlText w:val="%4."/>
+      <w:lvlJc w:val="left"/>
+      <w:pPr>
+        <w:tabs>
+          <w:tab w:val="num" w:pos="2880"/>
+        </w:tabs>
+        <w:ind w:left="2880" w:hanging="360"/>
+      </w:pPr>
+    </w:lvl>
+    <w:lvl w:ilvl="4" w:tentative="1">
+      <w:start w:val="1"/>
+      <w:numFmt w:val="decimal"/>
+      <w:lvlText w:val="%5."/>
+      <w:lvlJc w:val="left"/>
+      <w:pPr>
+        <w:tabs>
+          <w:tab w:val="num" w:pos="3600"/>
+        </w:tabs>
+        <w:ind w:left="3600" w:hanging="360"/>
+      </w:pPr>
+    </w:lvl>
+    <w:lvl w:ilvl="5" w:tentative="1">
+      <w:start w:val="1"/>
+      <w:numFmt w:val="decimal"/>
+      <w:lvlText w:val="%6."/>
+      <w:lvlJc w:val="left"/>
+      <w:pPr>
+        <w:tabs>
+          <w:tab w:val="num" w:pos="4320"/>
+        </w:tabs>
+        <w:ind w:left="4320" w:hanging="360"/>
+      </w:pPr>
+    </w:lvl>
+    <w:lvl w:ilvl="6" w:tentative="1">
+      <w:start w:val="1"/>
+      <w:numFmt w:val="decimal"/>
+      <w:lvlText w:val="%7."/>
+      <w:lvlJc w:val="left"/>
+      <w:pPr>
+        <w:tabs>
+          <w:tab w:val="num" w:pos="5040"/>
+        </w:tabs>
+        <w:ind w:left="5040" w:hanging="360"/>
+      </w:pPr>
+    </w:lvl>
+    <w:lvl w:ilvl="7" w:tentative="1">
+      <w:start w:val="1"/>
+      <w:numFmt w:val="decimal"/>
+      <w:lvlText w:val="%8."/>
+      <w:lvlJc w:val="left"/>
+      <w:pPr>
+        <w:tabs>
+          <w:tab w:val="num" w:pos="5760"/>
+        </w:tabs>
+        <w:ind w:left="5760" w:hanging="360"/>
+      </w:pPr>
+    </w:lvl>
+    <w:lvl w:ilvl="8" w:tentative="1">
+      <w:start w:val="1"/>
+      <w:numFmt w:val="decimal"/>
+      <w:lvlText w:val="%9."/>
+      <w:lvlJc w:val="left"/>
+      <w:pPr>
+        <w:tabs>
+          <w:tab w:val="num" w:pos="6480"/>
+        </w:tabs>
+        <w:ind w:left="6480" w:hanging="360"/>
+      </w:pPr>
+    </w:lvl>
+  </w:abstractNum>
+  <w:abstractNum w:abstractNumId="18" w15:restartNumberingAfterBreak="0">
     <w:nsid w:val="5649666B"/>
     <w:multiLevelType w:val="multilevel"/>
     <w:tmpl w:val="F91EB80C"/>
@@ -3235,7 +4003,156 @@
       </w:rPr>
     </w:lvl>
   </w:abstractNum>
-  <w:abstractNum w:abstractNumId="13" w15:restartNumberingAfterBreak="0">
+  <w:abstractNum w:abstractNumId="19" w15:restartNumberingAfterBreak="0">
+    <w:nsid w:val="5EE41C77"/>
+    <w:multiLevelType w:val="multilevel"/>
+    <w:tmpl w:val="7E621438"/>
+    <w:lvl w:ilvl="0">
+      <w:start w:val="1"/>
+      <w:numFmt w:val="bullet"/>
+      <w:lvlText w:val=""/>
+      <w:lvlJc w:val="left"/>
+      <w:pPr>
+        <w:tabs>
+          <w:tab w:val="num" w:pos="720"/>
+        </w:tabs>
+        <w:ind w:left="720" w:hanging="360"/>
+      </w:pPr>
+      <w:rPr>
+        <w:rFonts w:ascii="Symbol" w:hAnsi="Symbol" w:hint="default"/>
+        <w:sz w:val="20"/>
+      </w:rPr>
+    </w:lvl>
+    <w:lvl w:ilvl="1" w:tentative="1">
+      <w:start w:val="1"/>
+      <w:numFmt w:val="bullet"/>
+      <w:lvlText w:val="o"/>
+      <w:lvlJc w:val="left"/>
+      <w:pPr>
+        <w:tabs>
+          <w:tab w:val="num" w:pos="1440"/>
+        </w:tabs>
+        <w:ind w:left="1440" w:hanging="360"/>
+      </w:pPr>
+      <w:rPr>
+        <w:rFonts w:ascii="Courier New" w:hAnsi="Courier New" w:hint="default"/>
+        <w:sz w:val="20"/>
+      </w:rPr>
+    </w:lvl>
+    <w:lvl w:ilvl="2" w:tentative="1">
+      <w:start w:val="1"/>
+      <w:numFmt w:val="bullet"/>
+      <w:lvlText w:val=""/>
+      <w:lvlJc w:val="left"/>
+      <w:pPr>
+        <w:tabs>
+          <w:tab w:val="num" w:pos="2160"/>
+        </w:tabs>
+        <w:ind w:left="2160" w:hanging="360"/>
+      </w:pPr>
+      <w:rPr>
+        <w:rFonts w:ascii="Wingdings" w:hAnsi="Wingdings" w:hint="default"/>
+        <w:sz w:val="20"/>
+      </w:rPr>
+    </w:lvl>
+    <w:lvl w:ilvl="3" w:tentative="1">
+      <w:start w:val="1"/>
+      <w:numFmt w:val="bullet"/>
+      <w:lvlText w:val=""/>
+      <w:lvlJc w:val="left"/>
+      <w:pPr>
+        <w:tabs>
+          <w:tab w:val="num" w:pos="2880"/>
+        </w:tabs>
+        <w:ind w:left="2880" w:hanging="360"/>
+      </w:pPr>
+      <w:rPr>
+        <w:rFonts w:ascii="Wingdings" w:hAnsi="Wingdings" w:hint="default"/>
+        <w:sz w:val="20"/>
+      </w:rPr>
+    </w:lvl>
+    <w:lvl w:ilvl="4" w:tentative="1">
+      <w:start w:val="1"/>
+      <w:numFmt w:val="bullet"/>
+      <w:lvlText w:val=""/>
+      <w:lvlJc w:val="left"/>
+      <w:pPr>
+        <w:tabs>
+          <w:tab w:val="num" w:pos="3600"/>
+        </w:tabs>
+        <w:ind w:left="3600" w:hanging="360"/>
+      </w:pPr>
+      <w:rPr>
+        <w:rFonts w:ascii="Wingdings" w:hAnsi="Wingdings" w:hint="default"/>
+        <w:sz w:val="20"/>
+      </w:rPr>
+    </w:lvl>
+    <w:lvl w:ilvl="5" w:tentative="1">
+      <w:start w:val="1"/>
+      <w:numFmt w:val="bullet"/>
+      <w:lvlText w:val=""/>
+      <w:lvlJc w:val="left"/>
+      <w:pPr>
+        <w:tabs>
+          <w:tab w:val="num" w:pos="4320"/>
+        </w:tabs>
+        <w:ind w:left="4320" w:hanging="360"/>
+      </w:pPr>
+      <w:rPr>
+        <w:rFonts w:ascii="Wingdings" w:hAnsi="Wingdings" w:hint="default"/>
+        <w:sz w:val="20"/>
+      </w:rPr>
+    </w:lvl>
+    <w:lvl w:ilvl="6" w:tentative="1">
+      <w:start w:val="1"/>
+      <w:numFmt w:val="bullet"/>
+      <w:lvlText w:val=""/>
+      <w:lvlJc w:val="left"/>
+      <w:pPr>
+        <w:tabs>
+          <w:tab w:val="num" w:pos="5040"/>
+        </w:tabs>
+        <w:ind w:left="5040" w:hanging="360"/>
+      </w:pPr>
+      <w:rPr>
+        <w:rFonts w:ascii="Wingdings" w:hAnsi="Wingdings" w:hint="default"/>
+        <w:sz w:val="20"/>
+      </w:rPr>
+    </w:lvl>
+    <w:lvl w:ilvl="7" w:tentative="1">
+      <w:start w:val="1"/>
+      <w:numFmt w:val="bullet"/>
+      <w:lvlText w:val=""/>
+      <w:lvlJc w:val="left"/>
+      <w:pPr>
+        <w:tabs>
+          <w:tab w:val="num" w:pos="5760"/>
+        </w:tabs>
+        <w:ind w:left="5760" w:hanging="360"/>
+      </w:pPr>
+      <w:rPr>
+        <w:rFonts w:ascii="Wingdings" w:hAnsi="Wingdings" w:hint="default"/>
+        <w:sz w:val="20"/>
+      </w:rPr>
+    </w:lvl>
+    <w:lvl w:ilvl="8" w:tentative="1">
+      <w:start w:val="1"/>
+      <w:numFmt w:val="bullet"/>
+      <w:lvlText w:val=""/>
+      <w:lvlJc w:val="left"/>
+      <w:pPr>
+        <w:tabs>
+          <w:tab w:val="num" w:pos="6480"/>
+        </w:tabs>
+        <w:ind w:left="6480" w:hanging="360"/>
+      </w:pPr>
+      <w:rPr>
+        <w:rFonts w:ascii="Wingdings" w:hAnsi="Wingdings" w:hint="default"/>
+        <w:sz w:val="20"/>
+      </w:rPr>
+    </w:lvl>
+  </w:abstractNum>
+  <w:abstractNum w:abstractNumId="20" w15:restartNumberingAfterBreak="0">
     <w:nsid w:val="66410AAE"/>
     <w:multiLevelType w:val="hybridMultilevel"/>
     <w:tmpl w:val="D99014A0"/>
@@ -3348,7 +4265,7 @@
       </w:rPr>
     </w:lvl>
   </w:abstractNum>
-  <w:abstractNum w:abstractNumId="14" w15:restartNumberingAfterBreak="0">
+  <w:abstractNum w:abstractNumId="21" w15:restartNumberingAfterBreak="0">
     <w:nsid w:val="6CA537C1"/>
     <w:multiLevelType w:val="multilevel"/>
     <w:tmpl w:val="54DC084E"/>
@@ -3497,7 +4414,7 @@
       </w:rPr>
     </w:lvl>
   </w:abstractNum>
-  <w:abstractNum w:abstractNumId="15" w15:restartNumberingAfterBreak="0">
+  <w:abstractNum w:abstractNumId="22" w15:restartNumberingAfterBreak="0">
     <w:nsid w:val="703D1B62"/>
     <w:multiLevelType w:val="multilevel"/>
     <w:tmpl w:val="79D66A9E"/>
@@ -3646,7 +4563,7 @@
       </w:rPr>
     </w:lvl>
   </w:abstractNum>
-  <w:abstractNum w:abstractNumId="16" w15:restartNumberingAfterBreak="0">
+  <w:abstractNum w:abstractNumId="23" w15:restartNumberingAfterBreak="0">
     <w:nsid w:val="77AD78FE"/>
     <w:multiLevelType w:val="multilevel"/>
     <w:tmpl w:val="0478EE8A"/>
@@ -3795,7 +4712,156 @@
       </w:rPr>
     </w:lvl>
   </w:abstractNum>
-  <w:abstractNum w:abstractNumId="17" w15:restartNumberingAfterBreak="0">
+  <w:abstractNum w:abstractNumId="24" w15:restartNumberingAfterBreak="0">
+    <w:nsid w:val="7B53034B"/>
+    <w:multiLevelType w:val="multilevel"/>
+    <w:tmpl w:val="0CFA2D14"/>
+    <w:lvl w:ilvl="0">
+      <w:start w:val="1"/>
+      <w:numFmt w:val="bullet"/>
+      <w:lvlText w:val=""/>
+      <w:lvlJc w:val="left"/>
+      <w:pPr>
+        <w:tabs>
+          <w:tab w:val="num" w:pos="720"/>
+        </w:tabs>
+        <w:ind w:left="720" w:hanging="360"/>
+      </w:pPr>
+      <w:rPr>
+        <w:rFonts w:ascii="Symbol" w:hAnsi="Symbol" w:hint="default"/>
+        <w:sz w:val="20"/>
+      </w:rPr>
+    </w:lvl>
+    <w:lvl w:ilvl="1" w:tentative="1">
+      <w:start w:val="1"/>
+      <w:numFmt w:val="bullet"/>
+      <w:lvlText w:val="o"/>
+      <w:lvlJc w:val="left"/>
+      <w:pPr>
+        <w:tabs>
+          <w:tab w:val="num" w:pos="1440"/>
+        </w:tabs>
+        <w:ind w:left="1440" w:hanging="360"/>
+      </w:pPr>
+      <w:rPr>
+        <w:rFonts w:ascii="Courier New" w:hAnsi="Courier New" w:hint="default"/>
+        <w:sz w:val="20"/>
+      </w:rPr>
+    </w:lvl>
+    <w:lvl w:ilvl="2" w:tentative="1">
+      <w:start w:val="1"/>
+      <w:numFmt w:val="bullet"/>
+      <w:lvlText w:val=""/>
+      <w:lvlJc w:val="left"/>
+      <w:pPr>
+        <w:tabs>
+          <w:tab w:val="num" w:pos="2160"/>
+        </w:tabs>
+        <w:ind w:left="2160" w:hanging="360"/>
+      </w:pPr>
+      <w:rPr>
+        <w:rFonts w:ascii="Wingdings" w:hAnsi="Wingdings" w:hint="default"/>
+        <w:sz w:val="20"/>
+      </w:rPr>
+    </w:lvl>
+    <w:lvl w:ilvl="3" w:tentative="1">
+      <w:start w:val="1"/>
+      <w:numFmt w:val="bullet"/>
+      <w:lvlText w:val=""/>
+      <w:lvlJc w:val="left"/>
+      <w:pPr>
+        <w:tabs>
+          <w:tab w:val="num" w:pos="2880"/>
+        </w:tabs>
+        <w:ind w:left="2880" w:hanging="360"/>
+      </w:pPr>
+      <w:rPr>
+        <w:rFonts w:ascii="Wingdings" w:hAnsi="Wingdings" w:hint="default"/>
+        <w:sz w:val="20"/>
+      </w:rPr>
+    </w:lvl>
+    <w:lvl w:ilvl="4" w:tentative="1">
+      <w:start w:val="1"/>
+      <w:numFmt w:val="bullet"/>
+      <w:lvlText w:val=""/>
+      <w:lvlJc w:val="left"/>
+      <w:pPr>
+        <w:tabs>
+          <w:tab w:val="num" w:pos="3600"/>
+        </w:tabs>
+        <w:ind w:left="3600" w:hanging="360"/>
+      </w:pPr>
+      <w:rPr>
+        <w:rFonts w:ascii="Wingdings" w:hAnsi="Wingdings" w:hint="default"/>
+        <w:sz w:val="20"/>
+      </w:rPr>
+    </w:lvl>
+    <w:lvl w:ilvl="5" w:tentative="1">
+      <w:start w:val="1"/>
+      <w:numFmt w:val="bullet"/>
+      <w:lvlText w:val=""/>
+      <w:lvlJc w:val="left"/>
+      <w:pPr>
+        <w:tabs>
+          <w:tab w:val="num" w:pos="4320"/>
+        </w:tabs>
+        <w:ind w:left="4320" w:hanging="360"/>
+      </w:pPr>
+      <w:rPr>
+        <w:rFonts w:ascii="Wingdings" w:hAnsi="Wingdings" w:hint="default"/>
+        <w:sz w:val="20"/>
+      </w:rPr>
+    </w:lvl>
+    <w:lvl w:ilvl="6" w:tentative="1">
+      <w:start w:val="1"/>
+      <w:numFmt w:val="bullet"/>
+      <w:lvlText w:val=""/>
+      <w:lvlJc w:val="left"/>
+      <w:pPr>
+        <w:tabs>
+          <w:tab w:val="num" w:pos="5040"/>
+        </w:tabs>
+        <w:ind w:left="5040" w:hanging="360"/>
+      </w:pPr>
+      <w:rPr>
+        <w:rFonts w:ascii="Wingdings" w:hAnsi="Wingdings" w:hint="default"/>
+        <w:sz w:val="20"/>
+      </w:rPr>
+    </w:lvl>
+    <w:lvl w:ilvl="7" w:tentative="1">
+      <w:start w:val="1"/>
+      <w:numFmt w:val="bullet"/>
+      <w:lvlText w:val=""/>
+      <w:lvlJc w:val="left"/>
+      <w:pPr>
+        <w:tabs>
+          <w:tab w:val="num" w:pos="5760"/>
+        </w:tabs>
+        <w:ind w:left="5760" w:hanging="360"/>
+      </w:pPr>
+      <w:rPr>
+        <w:rFonts w:ascii="Wingdings" w:hAnsi="Wingdings" w:hint="default"/>
+        <w:sz w:val="20"/>
+      </w:rPr>
+    </w:lvl>
+    <w:lvl w:ilvl="8" w:tentative="1">
+      <w:start w:val="1"/>
+      <w:numFmt w:val="bullet"/>
+      <w:lvlText w:val=""/>
+      <w:lvlJc w:val="left"/>
+      <w:pPr>
+        <w:tabs>
+          <w:tab w:val="num" w:pos="6480"/>
+        </w:tabs>
+        <w:ind w:left="6480" w:hanging="360"/>
+      </w:pPr>
+      <w:rPr>
+        <w:rFonts w:ascii="Wingdings" w:hAnsi="Wingdings" w:hint="default"/>
+        <w:sz w:val="20"/>
+      </w:rPr>
+    </w:lvl>
+  </w:abstractNum>
+  <w:abstractNum w:abstractNumId="25" w15:restartNumberingAfterBreak="0">
     <w:nsid w:val="7BC75FAC"/>
     <w:multiLevelType w:val="multilevel"/>
     <w:tmpl w:val="04090025"/>
@@ -3891,58 +4957,82 @@
     </w:lvl>
   </w:abstractNum>
   <w:num w:numId="1" w16cid:durableId="356154409">
+    <w:abstractNumId w:val="18"/>
+  </w:num>
+  <w:num w:numId="2" w16cid:durableId="355926984">
     <w:abstractNumId w:val="12"/>
   </w:num>
-  <w:num w:numId="2" w16cid:durableId="355926984">
+  <w:num w:numId="3" w16cid:durableId="1151948933">
+    <w:abstractNumId w:val="13"/>
+  </w:num>
+  <w:num w:numId="4" w16cid:durableId="707800933">
+    <w:abstractNumId w:val="2"/>
+  </w:num>
+  <w:num w:numId="5" w16cid:durableId="247085606">
+    <w:abstractNumId w:val="25"/>
+  </w:num>
+  <w:num w:numId="6" w16cid:durableId="2022706307">
+    <w:abstractNumId w:val="16"/>
+  </w:num>
+  <w:num w:numId="7" w16cid:durableId="988024615">
+    <w:abstractNumId w:val="5"/>
+  </w:num>
+  <w:num w:numId="8" w16cid:durableId="154734688">
     <w:abstractNumId w:val="8"/>
   </w:num>
-  <w:num w:numId="3" w16cid:durableId="1151948933">
+  <w:num w:numId="9" w16cid:durableId="1445422201">
+    <w:abstractNumId w:val="23"/>
+  </w:num>
+  <w:num w:numId="10" w16cid:durableId="209652387">
+    <w:abstractNumId w:val="11"/>
+  </w:num>
+  <w:num w:numId="11" w16cid:durableId="1720012278">
+    <w:abstractNumId w:val="7"/>
+  </w:num>
+  <w:num w:numId="12" w16cid:durableId="109201401">
+    <w:abstractNumId w:val="3"/>
+  </w:num>
+  <w:num w:numId="13" w16cid:durableId="2125615704">
+    <w:abstractNumId w:val="21"/>
+  </w:num>
+  <w:num w:numId="14" w16cid:durableId="268783498">
+    <w:abstractNumId w:val="6"/>
+  </w:num>
+  <w:num w:numId="15" w16cid:durableId="1355040352">
+    <w:abstractNumId w:val="14"/>
+  </w:num>
+  <w:num w:numId="16" w16cid:durableId="770246607">
+    <w:abstractNumId w:val="1"/>
+  </w:num>
+  <w:num w:numId="17" w16cid:durableId="1237933641">
+    <w:abstractNumId w:val="20"/>
+  </w:num>
+  <w:num w:numId="18" w16cid:durableId="1686324748">
+    <w:abstractNumId w:val="22"/>
+  </w:num>
+  <w:num w:numId="19" w16cid:durableId="757407610">
     <w:abstractNumId w:val="9"/>
   </w:num>
-  <w:num w:numId="4" w16cid:durableId="707800933">
-    <w:abstractNumId w:val="1"/>
-  </w:num>
-  <w:num w:numId="5" w16cid:durableId="247085606">
+  <w:num w:numId="20" w16cid:durableId="406074132">
     <w:abstractNumId w:val="17"/>
   </w:num>
-  <w:num w:numId="6" w16cid:durableId="2022706307">
-    <w:abstractNumId w:val="11"/>
+  <w:num w:numId="21" w16cid:durableId="494762280">
+    <w:abstractNumId w:val="15"/>
   </w:num>
-  <w:num w:numId="7" w16cid:durableId="988024615">
-    <w:abstractNumId w:val="3"/>
+  <w:num w:numId="22" w16cid:durableId="1310204601">
+    <w:abstractNumId w:val="10"/>
   </w:num>
-  <w:num w:numId="8" w16cid:durableId="154734688">
-    <w:abstractNumId w:val="6"/>
+  <w:num w:numId="23" w16cid:durableId="308365267">
+    <w:abstractNumId w:val="19"/>
   </w:num>
-  <w:num w:numId="9" w16cid:durableId="1445422201">
-    <w:abstractNumId w:val="16"/>
-  </w:num>
-  <w:num w:numId="10" w16cid:durableId="209652387">
-    <w:abstractNumId w:val="7"/>
-  </w:num>
-  <w:num w:numId="11" w16cid:durableId="1720012278">
-    <w:abstractNumId w:val="5"/>
-  </w:num>
-  <w:num w:numId="12" w16cid:durableId="109201401">
-    <w:abstractNumId w:val="2"/>
-  </w:num>
-  <w:num w:numId="13" w16cid:durableId="2125615704">
-    <w:abstractNumId w:val="14"/>
-  </w:num>
-  <w:num w:numId="14" w16cid:durableId="268783498">
+  <w:num w:numId="24" w16cid:durableId="477379818">
     <w:abstractNumId w:val="4"/>
   </w:num>
-  <w:num w:numId="15" w16cid:durableId="1355040352">
-    <w:abstractNumId w:val="10"/>
-  </w:num>
-  <w:num w:numId="16" w16cid:durableId="770246607">
+  <w:num w:numId="25" w16cid:durableId="1081491966">
     <w:abstractNumId w:val="0"/>
   </w:num>
-  <w:num w:numId="17" w16cid:durableId="1237933641">
-    <w:abstractNumId w:val="13"/>
-  </w:num>
-  <w:num w:numId="18" w16cid:durableId="1686324748">
-    <w:abstractNumId w:val="15"/>
+  <w:num w:numId="26" w16cid:durableId="1879775895">
+    <w:abstractNumId w:val="24"/>
   </w:num>
 </w:numbering>
 </file>
@@ -4588,6 +5678,7 @@
   <w:style w:type="character" w:default="1" w:styleId="DefaultParagraphFont">
     <w:name w:val="Default Paragraph Font"/>
     <w:uiPriority w:val="1"/>
+    <w:semiHidden/>
     <w:unhideWhenUsed/>
   </w:style>
   <w:style w:type="table" w:default="1" w:styleId="TableNormal">
@@ -4941,6 +6032,19 @@
       <w:bCs/>
     </w:rPr>
   </w:style>
+  <w:style w:type="character" w:styleId="HTMLCode">
+    <w:name w:val="HTML Code"/>
+    <w:basedOn w:val="DefaultParagraphFont"/>
+    <w:uiPriority w:val="99"/>
+    <w:semiHidden/>
+    <w:unhideWhenUsed/>
+    <w:rsid w:val="00AB2B0F"/>
+    <w:rPr>
+      <w:rFonts w:ascii="Courier New" w:eastAsia="Times New Roman" w:hAnsi="Courier New" w:cs="Courier New"/>
+      <w:sz w:val="20"/>
+      <w:szCs w:val="20"/>
+    </w:rPr>
+  </w:style>
 </w:styles>
 </file>
 

</xml_diff>